<commit_message>
Aire Express: inducción de la Setter con el flujo del corte V1 (28-oct)
Escuela y guiones con el formulario de resultado, las tareas nuevas y los leads de Meta solo por llamada.
Se quitan nombres de clientes de las páginas públicas.

Co-Authored-By: Claude Opus 5.5 <noreply@anthropic.com>
</commit_message>
<xml_diff>
--- a/induccion-aire-express/guiones/docs/00_LEEME_PRIMERO.docx
+++ b/induccion-aire-express/guiones/docs/00_LEEME_PRIMERO.docx
@@ -438,7 +438,7 @@
                 <w:sz w:val="17"/>
                 <w:szCs w:val="17"/>
               </w:rPr>
-              <w:t xml:space="preserve">El guion del primer contacto y de los 4 intentos con doble marcado.</w:t>
+              <w:t xml:space="preserve">El guion del primer contacto y de los 6 intentos con doble marcado.</w:t>
             </w:r>
           </w:p>
         </w:tc>
@@ -2262,6 +2262,169 @@
           <w:sz w:val="24"/>
           <w:szCs w:val="24"/>
         </w:rPr>
+        <w:t xml:space="preserve">El flujo en 1 minuto</w:t>
+      </w:r>
+    </w:p>
+    <w:p>
+      <w:pPr>
+        <w:spacing w:after="110"/>
+      </w:pPr>
+      <w:r>
+        <w:rPr>
+          <w:rFonts w:ascii="Arial" w:cs="Arial" w:eastAsia="Arial" w:hAnsi="Arial"/>
+          <w:color w:val="333333"/>
+          <w:sz w:val="20"/>
+          <w:szCs w:val="20"/>
+        </w:rPr>
+        <w:t xml:space="preserve">Tú haces 3 cosas: </w:t>
+      </w:r>
+      <w:r>
+        <w:rPr>
+          <w:rFonts w:ascii="Arial" w:cs="Arial" w:eastAsia="Arial" w:hAnsi="Arial"/>
+          <w:b/>
+          <w:bCs/>
+          <w:color w:val="333333"/>
+          <w:sz w:val="20"/>
+          <w:szCs w:val="20"/>
+        </w:rPr>
+        <w:t xml:space="preserve">llamas, llenas el formulario de resultado y haces las tareas que te llegan.</w:t>
+      </w:r>
+      <w:r>
+        <w:rPr>
+          <w:rFonts w:ascii="Arial" w:cs="Arial" w:eastAsia="Arial" w:hAnsi="Arial"/>
+          <w:color w:val="333333"/>
+          <w:sz w:val="20"/>
+          <w:szCs w:val="20"/>
+        </w:rPr>
+        <w:t xml:space="preserve"> Lo demás lo hace el sistema.</w:t>
+      </w:r>
+    </w:p>
+    <w:p>
+      <w:pPr>
+        <w:spacing w:after="50"/>
+        <w:ind w:left="360" w:hanging="300"/>
+      </w:pPr>
+      <w:r>
+        <w:rPr>
+          <w:rFonts w:ascii="Arial" w:cs="Arial" w:eastAsia="Arial" w:hAnsi="Arial"/>
+          <w:color w:val="333333"/>
+          <w:sz w:val="20"/>
+          <w:szCs w:val="20"/>
+        </w:rPr>
+        <w:t xml:space="preserve">1. </w:t>
+      </w:r>
+      <w:r>
+        <w:rPr>
+          <w:rFonts w:ascii="Arial" w:cs="Arial" w:eastAsia="Arial" w:hAnsi="Arial"/>
+          <w:color w:val="333333"/>
+          <w:sz w:val="20"/>
+          <w:szCs w:val="20"/>
+        </w:rPr>
+        <w:t xml:space="preserve">Llega un lead: te crea la tarea "Llamar - Intento 1".</w:t>
+      </w:r>
+    </w:p>
+    <w:p>
+      <w:pPr>
+        <w:spacing w:after="50"/>
+        <w:ind w:left="360" w:hanging="300"/>
+      </w:pPr>
+      <w:r>
+        <w:rPr>
+          <w:rFonts w:ascii="Arial" w:cs="Arial" w:eastAsia="Arial" w:hAnsi="Arial"/>
+          <w:color w:val="333333"/>
+          <w:sz w:val="20"/>
+          <w:szCs w:val="20"/>
+        </w:rPr>
+        <w:t xml:space="preserve">2. </w:t>
+      </w:r>
+      <w:r>
+        <w:rPr>
+          <w:rFonts w:ascii="Arial" w:cs="Arial" w:eastAsia="Arial" w:hAnsi="Arial"/>
+          <w:color w:val="333333"/>
+          <w:sz w:val="20"/>
+          <w:szCs w:val="20"/>
+        </w:rPr>
+        <w:t xml:space="preserve">Llamas desde la app (doble marcado).</w:t>
+      </w:r>
+    </w:p>
+    <w:p>
+      <w:pPr>
+        <w:spacing w:after="50"/>
+        <w:ind w:left="360" w:hanging="300"/>
+      </w:pPr>
+      <w:r>
+        <w:rPr>
+          <w:rFonts w:ascii="Arial" w:cs="Arial" w:eastAsia="Arial" w:hAnsi="Arial"/>
+          <w:color w:val="333333"/>
+          <w:sz w:val="20"/>
+          <w:szCs w:val="20"/>
+        </w:rPr>
+        <w:t xml:space="preserve">3. </w:t>
+      </w:r>
+      <w:r>
+        <w:rPr>
+          <w:rFonts w:ascii="Arial" w:cs="Arial" w:eastAsia="Arial" w:hAnsi="Arial"/>
+          <w:color w:val="333333"/>
+          <w:sz w:val="20"/>
+          <w:szCs w:val="20"/>
+        </w:rPr>
+        <w:t xml:space="preserve">Al colgar llenas el formulario (https://api.leadconnectorhq.com/widget/form/DGoYUAAWeaqimug9GUci) con uno de los 8 resultados: Agendó visita · No contesta · Llamar después · No interesado · Número equivocado · Fuera de zona · Esperando foto / precio · Precio aceptado - enviar contrato.</w:t>
+      </w:r>
+    </w:p>
+    <w:p>
+      <w:pPr>
+        <w:spacing w:after="50"/>
+        <w:ind w:left="360" w:hanging="300"/>
+      </w:pPr>
+      <w:r>
+        <w:rPr>
+          <w:rFonts w:ascii="Arial" w:cs="Arial" w:eastAsia="Arial" w:hAnsi="Arial"/>
+          <w:color w:val="333333"/>
+          <w:sz w:val="20"/>
+          <w:szCs w:val="20"/>
+        </w:rPr>
+        <w:t xml:space="preserve">4. </w:t>
+      </w:r>
+      <w:r>
+        <w:rPr>
+          <w:rFonts w:ascii="Arial" w:cs="Arial" w:eastAsia="Arial" w:hAnsi="Arial"/>
+          <w:color w:val="333333"/>
+          <w:sz w:val="20"/>
+          <w:szCs w:val="20"/>
+        </w:rPr>
+        <w:t xml:space="preserve">Reemplazo de furnace: foto del furnace → Juan David da el precio → contrato que tú mandas a mano.</w:t>
+      </w:r>
+    </w:p>
+    <w:p>
+      <w:pPr>
+        <w:spacing w:after="110"/>
+      </w:pPr>
+      <w:r>
+        <w:rPr>
+          <w:rFonts w:ascii="Arial" w:cs="Arial" w:eastAsia="Arial" w:hAnsi="Arial"/>
+          <w:color w:val="333333"/>
+          <w:sz w:val="20"/>
+          <w:szCs w:val="20"/>
+        </w:rPr>
+        <w:t xml:space="preserve">El detalle completo está en la Inducción Comercial (sección "El flujo en 1 minuto").</w:t>
+      </w:r>
+    </w:p>
+    <w:p>
+      <w:pPr>
+        <w:keepNext/>
+        <w:shd w:fill="1B2A4A" w:val="clear"/>
+        <w:spacing w:after="140" w:before="320"/>
+        <w:ind w:left="140"/>
+      </w:pPr>
+      <w:r>
+        <w:rPr>
+          <w:rFonts w:ascii="Arial" w:cs="Arial" w:eastAsia="Arial" w:hAnsi="Arial"/>
+          <w:b/>
+          <w:bCs/>
+          <w:color w:val="FFFFFF"/>
+          <w:sz w:val="24"/>
+          <w:szCs w:val="24"/>
+        </w:rPr>
         <w:t xml:space="preserve">Cosas que no cambian (para que no haya dudas)</w:t>
       </w:r>
     </w:p>
@@ -2471,7 +2634,7 @@
           <w:sz w:val="20"/>
           <w:szCs w:val="20"/>
         </w:rPr>
-        <w:t xml:space="preserve">4 intentos, cada uno con doble marcado</w:t>
+        <w:t xml:space="preserve">6 intentos, cada uno con doble marcado</w:t>
       </w:r>
       <w:r>
         <w:rPr>
@@ -2480,7 +2643,7 @@
           <w:sz w:val="20"/>
           <w:szCs w:val="20"/>
         </w:rPr>
-        <w:t xml:space="preserve"> (Día 0 mañana y tarde, Día 2 y Día 5). Una nota por intento.</w:t>
+        <w:t xml:space="preserve"> (Día 0, Día 0 + 3 horas, Día 1, Día 2, Día 5 y Día 10: 12 marcadas). Después de cada llamada llenas el formulario de resultado. Si en 10 días no agenda, el sistema lo pasa solo a Seguimiento Mensual.</w:t>
       </w:r>
     </w:p>
     <w:p>
@@ -2556,8 +2719,8 @@
       </w:r>
     </w:p>
     <w:sectPr>
-      <w:headerReference w:type="default" r:id="rId7"/>
-      <w:footerReference w:type="default" r:id="rId8"/>
+      <w:headerReference w:type="default" r:id="rId6"/>
+      <w:footerReference w:type="default" r:id="rId7"/>
       <w:pgSz w:w="12240" w:h="15840" w:orient="portrait"/>
       <w:pgMar w:top="1134" w:right="1134" w:bottom="1134" w:left="1134" w:header="708" w:footer="708" w:gutter="0"/>
       <w:pgNumType/>
@@ -2565,10 +2728,6 @@
     </w:sectPr>
   </w:body>
 </w:document>
-</file>
-
-<file path=word/comments.xml><?xml version="1.0" encoding="utf-8"?>
-<w:comments xmlns:cx="http://schemas.microsoft.com/office/drawing/2014/chartex" xmlns:cx1="http://schemas.microsoft.com/office/drawing/2015/9/8/chartex" xmlns:cx2="http://schemas.microsoft.com/office/drawing/2015/10/21/chartex" xmlns:cx3="http://schemas.microsoft.com/office/drawing/2016/5/9/chartex" xmlns:cx4="http://schemas.microsoft.com/office/drawing/2016/5/10/chartex" xmlns:cx5="http://schemas.microsoft.com/office/drawing/2016/5/11/chartex" xmlns:cx6="http://schemas.microsoft.com/office/drawing/2016/5/12/chartex" xmlns:cx7="http://schemas.microsoft.com/office/drawing/2016/5/13/chartex" xmlns:cx8="http://schemas.microsoft.com/office/drawing/2016/5/14/chartex" xmlns:mc="http://schemas.openxmlformats.org/markup-compatibility/2006" xmlns:aink="http://schemas.microsoft.com/office/drawing/2016/ink" xmlns:am3d="http://schemas.microsoft.com/office/drawing/2017/model3d" xmlns:o="urn:schemas-microsoft-com:office:office" xmlns:r="http://schemas.openxmlformats.org/officeDocument/2006/relationships" xmlns:m="http://schemas.openxmlformats.org/officeDocument/2006/math" xmlns:v="urn:schemas-microsoft-com:vml" xmlns:wp14="http://schemas.microsoft.com/office/word/2010/wordprocessingDrawing" xmlns:wp="http://schemas.openxmlformats.org/drawingml/2006/wordprocessingDrawing" xmlns:w10="urn:schemas-microsoft-com:office:word" xmlns:w="http://schemas.openxmlformats.org/wordprocessingml/2006/main" xmlns:w14="http://schemas.microsoft.com/office/word/2010/wordml" xmlns:w15="http://schemas.microsoft.com/office/word/2012/wordml" xmlns:w16cex="http://schemas.microsoft.com/office/word/2018/wordml/cex" xmlns:w16cid="http://schemas.microsoft.com/office/word/2016/wordml/cid" xmlns:w16="http://schemas.microsoft.com/office/word/2018/wordml" xmlns:w16sdtdh="http://schemas.microsoft.com/office/word/2020/wordml/sdtdatahash" xmlns:w16se="http://schemas.microsoft.com/office/word/2015/wordml/symex" xmlns:wpg="http://schemas.microsoft.com/office/word/2010/wordprocessingGroup" xmlns:wpi="http://schemas.microsoft.com/office/word/2010/wordprocessingInk" xmlns:wne="http://schemas.microsoft.com/office/word/2006/wordml" xmlns:wps="http://schemas.microsoft.com/office/word/2010/wordprocessingShape"/>
 </file>
 
 <file path=word/endnotes.xml><?xml version="1.0" encoding="utf-8"?>
@@ -2635,8 +2794,32 @@
         <w:szCs w:val="16"/>
       </w:rPr>
       <w:fldChar w:fldCharType="begin"/>
+    </w:r>
+    <w:r>
+      <w:rPr>
+        <w:rFonts w:ascii="Arial" w:cs="Arial" w:eastAsia="Arial" w:hAnsi="Arial"/>
+        <w:color w:val="666666"/>
+        <w:sz w:val="16"/>
+        <w:szCs w:val="16"/>
+      </w:rPr>
       <w:instrText xml:space="preserve">PAGE</w:instrText>
+    </w:r>
+    <w:r>
+      <w:rPr>
+        <w:rFonts w:ascii="Arial" w:cs="Arial" w:eastAsia="Arial" w:hAnsi="Arial"/>
+        <w:color w:val="666666"/>
+        <w:sz w:val="16"/>
+        <w:szCs w:val="16"/>
+      </w:rPr>
       <w:fldChar w:fldCharType="separate"/>
+    </w:r>
+    <w:r>
+      <w:rPr>
+        <w:rFonts w:ascii="Arial" w:cs="Arial" w:eastAsia="Arial" w:hAnsi="Arial"/>
+        <w:color w:val="666666"/>
+        <w:sz w:val="16"/>
+        <w:szCs w:val="16"/>
+      </w:rPr>
       <w:fldChar w:fldCharType="end"/>
     </w:r>
     <w:r>
@@ -2656,8 +2839,32 @@
         <w:szCs w:val="16"/>
       </w:rPr>
       <w:fldChar w:fldCharType="begin"/>
+    </w:r>
+    <w:r>
+      <w:rPr>
+        <w:rFonts w:ascii="Arial" w:cs="Arial" w:eastAsia="Arial" w:hAnsi="Arial"/>
+        <w:color w:val="666666"/>
+        <w:sz w:val="16"/>
+        <w:szCs w:val="16"/>
+      </w:rPr>
       <w:instrText xml:space="preserve">NUMPAGES</w:instrText>
+    </w:r>
+    <w:r>
+      <w:rPr>
+        <w:rFonts w:ascii="Arial" w:cs="Arial" w:eastAsia="Arial" w:hAnsi="Arial"/>
+        <w:color w:val="666666"/>
+        <w:sz w:val="16"/>
+        <w:szCs w:val="16"/>
+      </w:rPr>
       <w:fldChar w:fldCharType="separate"/>
+    </w:r>
+    <w:r>
+      <w:rPr>
+        <w:rFonts w:ascii="Arial" w:cs="Arial" w:eastAsia="Arial" w:hAnsi="Arial"/>
+        <w:color w:val="666666"/>
+        <w:sz w:val="16"/>
+        <w:szCs w:val="16"/>
+      </w:rPr>
       <w:fldChar w:fldCharType="end"/>
     </w:r>
   </w:p>
@@ -2738,7 +2945,7 @@
 <w:numbering xmlns:wpc="http://schemas.microsoft.com/office/word/2010/wordprocessingCanvas" xmlns:mc="http://schemas.openxmlformats.org/markup-compatibility/2006" xmlns:o="urn:schemas-microsoft-com:office:office" xmlns:r="http://schemas.openxmlformats.org/officeDocument/2006/relationships" xmlns:m="http://schemas.openxmlformats.org/officeDocument/2006/math" xmlns:v="urn:schemas-microsoft-com:vml" xmlns:wp14="http://schemas.microsoft.com/office/word/2010/wordprocessingDrawing" xmlns:wp="http://schemas.openxmlformats.org/drawingml/2006/wordprocessingDrawing" xmlns:w10="urn:schemas-microsoft-com:office:word" xmlns:w="http://schemas.openxmlformats.org/wordprocessingml/2006/main" xmlns:w14="http://schemas.microsoft.com/office/word/2010/wordml" xmlns:w15="http://schemas.microsoft.com/office/word/2012/wordml" xmlns:wpg="http://schemas.microsoft.com/office/word/2010/wordprocessingGroup" xmlns:wpi="http://schemas.microsoft.com/office/word/2010/wordprocessingInk" xmlns:wne="http://schemas.microsoft.com/office/word/2006/wordml" xmlns:wps="http://schemas.microsoft.com/office/word/2010/wordprocessingShape" mc:Ignorable="w14 w15 wp14">
   <w:abstractNum w:abstractNumId="1" w15:restartNumberingAfterBreak="0">
     <w:multiLevelType w:val="hybridMultilevel"/>
-    <w:lvl w:ilvl="0" w15:tentative="1">
+    <w:lvl w:ilvl="0" w:tentative="1">
       <w:start w:val="1"/>
       <w:numFmt w:val="bullet"/>
       <w:lvlText w:val="●"/>
@@ -2747,7 +2954,7 @@
         <w:ind w:left="720" w:hanging="360"/>
       </w:pPr>
     </w:lvl>
-    <w:lvl w:ilvl="1" w15:tentative="1">
+    <w:lvl w:ilvl="1" w:tentative="1">
       <w:start w:val="1"/>
       <w:numFmt w:val="bullet"/>
       <w:lvlText w:val="○"/>
@@ -2756,7 +2963,7 @@
         <w:ind w:left="1440" w:hanging="360"/>
       </w:pPr>
     </w:lvl>
-    <w:lvl w:ilvl="2" w15:tentative="1">
+    <w:lvl w:ilvl="2" w:tentative="1">
       <w:start w:val="1"/>
       <w:numFmt w:val="bullet"/>
       <w:lvlText w:val="■"/>
@@ -2765,7 +2972,7 @@
         <w:ind w:left="2160" w:hanging="360"/>
       </w:pPr>
     </w:lvl>
-    <w:lvl w:ilvl="3" w15:tentative="1">
+    <w:lvl w:ilvl="3" w:tentative="1">
       <w:start w:val="1"/>
       <w:numFmt w:val="bullet"/>
       <w:lvlText w:val="●"/>
@@ -2774,7 +2981,7 @@
         <w:ind w:left="2880" w:hanging="360"/>
       </w:pPr>
     </w:lvl>
-    <w:lvl w:ilvl="4" w15:tentative="1">
+    <w:lvl w:ilvl="4" w:tentative="1">
       <w:start w:val="1"/>
       <w:numFmt w:val="bullet"/>
       <w:lvlText w:val="○"/>
@@ -2783,7 +2990,7 @@
         <w:ind w:left="3600" w:hanging="360"/>
       </w:pPr>
     </w:lvl>
-    <w:lvl w:ilvl="5" w15:tentative="1">
+    <w:lvl w:ilvl="5" w:tentative="1">
       <w:start w:val="1"/>
       <w:numFmt w:val="bullet"/>
       <w:lvlText w:val="■"/>
@@ -2792,7 +2999,7 @@
         <w:ind w:left="4320" w:hanging="360"/>
       </w:pPr>
     </w:lvl>
-    <w:lvl w:ilvl="6" w15:tentative="1">
+    <w:lvl w:ilvl="6" w:tentative="1">
       <w:start w:val="1"/>
       <w:numFmt w:val="bullet"/>
       <w:lvlText w:val="●"/>
@@ -2801,7 +3008,7 @@
         <w:ind w:left="5040" w:hanging="360"/>
       </w:pPr>
     </w:lvl>
-    <w:lvl w:ilvl="7" w15:tentative="1">
+    <w:lvl w:ilvl="7" w:tentative="1">
       <w:start w:val="1"/>
       <w:numFmt w:val="bullet"/>
       <w:lvlText w:val="●"/>
@@ -2810,7 +3017,7 @@
         <w:ind w:left="5760" w:hanging="360"/>
       </w:pPr>
     </w:lvl>
-    <w:lvl w:ilvl="8" w15:tentative="1">
+    <w:lvl w:ilvl="8" w:tentative="1">
       <w:start w:val="1"/>
       <w:numFmt w:val="bullet"/>
       <w:lvlText w:val="●"/>
@@ -2842,6 +3049,25 @@
     </w:rPrDefault>
     <w:pPrDefault/>
   </w:docDefaults>
+  <w:style w:type="paragraph" w:styleId="Normal" w:default="1">
+    <w:name w:val="Normal"/>
+    <w:qFormat/>
+  </w:style>
+  <w:style w:type="table" w:styleId="TableNormal" w:default="true">
+    <w:name w:val="Normal Table"/>
+    <w:uiPriority w:val="99"/>
+    <w:semiHidden/>
+    <w:unhideWhenUsed/>
+    <w:tblPr>
+      <w:tblInd w:type="dxa" w:w="0"/>
+      <w:tblCellMar>
+        <w:top w:type="dxa" w:w="0"/>
+        <w:left w:type="dxa" w:w="108"/>
+        <w:bottom w:type="dxa" w:w="0"/>
+        <w:right w:type="dxa" w:w="108"/>
+      </w:tblCellMar>
+    </w:tblPr>
+  </w:style>
   <w:style w:type="paragraph" w:styleId="Title">
     <w:name w:val="Title"/>
     <w:basedOn w:val="Normal"/>
@@ -2929,6 +3155,139 @@
     <w:basedOn w:val="Normal"/>
     <w:qFormat/>
   </w:style>
+  <w:style w:type="paragraph" w:styleId="Caption">
+    <w:name w:val="caption"/>
+    <w:basedOn w:val="Normal"/>
+    <w:next w:val="Normal"/>
+    <w:uiPriority w:val="35"/>
+    <w:semiHidden/>
+    <w:unhideWhenUsed/>
+    <w:qFormat/>
+    <w:pPr>
+      <w:spacing w:after="200"/>
+    </w:pPr>
+    <w:rPr>
+      <w:i/>
+      <w:iCs/>
+      <w:color w:val="44546A" w:themeColor="dark2"/>
+      <w:sz w:val="18"/>
+      <w:szCs w:val="18"/>
+    </w:rPr>
+  </w:style>
+  <w:style w:type="paragraph" w:styleId="Bibliography">
+    <w:name w:val="Bibliography"/>
+    <w:basedOn w:val="Normal"/>
+    <w:next w:val="Normal"/>
+    <w:uiPriority w:val="37"/>
+    <w:unhideWhenUsed/>
+  </w:style>
+  <w:style w:type="paragraph" w:styleId="TOC1">
+    <w:name w:val="toc 1"/>
+    <w:basedOn w:val="Normal"/>
+    <w:next w:val="Normal"/>
+    <w:uiPriority w:val="39"/>
+    <w:semiHidden/>
+    <w:unhideWhenUsed/>
+    <w:pPr>
+      <w:spacing w:after="100"/>
+    </w:pPr>
+  </w:style>
+  <w:style w:type="paragraph" w:styleId="TOC2">
+    <w:name w:val="toc 2"/>
+    <w:basedOn w:val="Normal"/>
+    <w:next w:val="Normal"/>
+    <w:uiPriority w:val="39"/>
+    <w:semiHidden/>
+    <w:unhideWhenUsed/>
+    <w:pPr>
+      <w:spacing w:after="100"/>
+      <w:ind w:left="200"/>
+    </w:pPr>
+  </w:style>
+  <w:style w:type="paragraph" w:styleId="TOC3">
+    <w:name w:val="toc 3"/>
+    <w:basedOn w:val="Normal"/>
+    <w:next w:val="Normal"/>
+    <w:uiPriority w:val="39"/>
+    <w:semiHidden/>
+    <w:unhideWhenUsed/>
+    <w:pPr>
+      <w:spacing w:after="100"/>
+      <w:ind w:left="400"/>
+    </w:pPr>
+  </w:style>
+  <w:style w:type="paragraph" w:styleId="TOC4">
+    <w:name w:val="toc 4"/>
+    <w:basedOn w:val="Normal"/>
+    <w:next w:val="Normal"/>
+    <w:uiPriority w:val="39"/>
+    <w:semiHidden/>
+    <w:unhideWhenUsed/>
+    <w:pPr>
+      <w:spacing w:after="100"/>
+      <w:ind w:left="600"/>
+    </w:pPr>
+  </w:style>
+  <w:style w:type="paragraph" w:styleId="TOC5">
+    <w:name w:val="toc 5"/>
+    <w:basedOn w:val="Normal"/>
+    <w:next w:val="Normal"/>
+    <w:uiPriority w:val="39"/>
+    <w:semiHidden/>
+    <w:unhideWhenUsed/>
+    <w:pPr>
+      <w:spacing w:after="100"/>
+      <w:ind w:left="800"/>
+    </w:pPr>
+  </w:style>
+  <w:style w:type="paragraph" w:styleId="TOC6">
+    <w:name w:val="toc 6"/>
+    <w:basedOn w:val="Normal"/>
+    <w:next w:val="Normal"/>
+    <w:uiPriority w:val="39"/>
+    <w:semiHidden/>
+    <w:unhideWhenUsed/>
+    <w:pPr>
+      <w:spacing w:after="100"/>
+      <w:ind w:left="1000"/>
+    </w:pPr>
+  </w:style>
+  <w:style w:type="paragraph" w:styleId="TOC7">
+    <w:name w:val="toc 7"/>
+    <w:basedOn w:val="Normal"/>
+    <w:next w:val="Normal"/>
+    <w:uiPriority w:val="39"/>
+    <w:semiHidden/>
+    <w:unhideWhenUsed/>
+    <w:pPr>
+      <w:spacing w:after="100"/>
+      <w:ind w:left="1200"/>
+    </w:pPr>
+  </w:style>
+  <w:style w:type="paragraph" w:styleId="TOC8">
+    <w:name w:val="toc 8"/>
+    <w:basedOn w:val="Normal"/>
+    <w:next w:val="Normal"/>
+    <w:uiPriority w:val="39"/>
+    <w:semiHidden/>
+    <w:unhideWhenUsed/>
+    <w:pPr>
+      <w:spacing w:after="100"/>
+      <w:ind w:left="1400"/>
+    </w:pPr>
+  </w:style>
+  <w:style w:type="paragraph" w:styleId="TOC9">
+    <w:name w:val="toc 9"/>
+    <w:basedOn w:val="Normal"/>
+    <w:next w:val="Normal"/>
+    <w:uiPriority w:val="39"/>
+    <w:semiHidden/>
+    <w:unhideWhenUsed/>
+    <w:pPr>
+      <w:spacing w:after="100"/>
+      <w:ind w:left="1600"/>
+    </w:pPr>
+  </w:style>
   <w:style w:type="character" w:styleId="Hyperlink">
     <w:name w:val="Hyperlink"/>
     <w:basedOn w:val="DefaultParagraphFont"/>
@@ -3013,5 +3372,302 @@
       <w:szCs w:val="20"/>
     </w:rPr>
   </w:style>
+  <w:style w:type="character" w:styleId="LineNumber">
+    <w:name w:val="line number"/>
+    <w:basedOn w:val="DefaultParagraphFont"/>
+    <w:uiPriority w:val="99"/>
+    <w:semiHidden/>
+    <w:unhideWhenUsed/>
+  </w:style>
 </w:styles>
+</file>
+
+<file path=word/theme/theme1.xml><?xml version="1.0" encoding="utf-8"?>
+<a:theme xmlns:a="http://schemas.openxmlformats.org/drawingml/2006/main" name="Office Theme">
+  <a:themeElements>
+    <a:clrScheme name="Office">
+      <a:dk1>
+        <a:sysClr val="windowText" lastClr="000000"/>
+      </a:dk1>
+      <a:lt1>
+        <a:sysClr val="window" lastClr="FFFFFF"/>
+      </a:lt1>
+      <a:dk2>
+        <a:srgbClr val="44546A"/>
+      </a:dk2>
+      <a:lt2>
+        <a:srgbClr val="E7E6E6"/>
+      </a:lt2>
+      <a:accent1>
+        <a:srgbClr val="4472C4"/>
+      </a:accent1>
+      <a:accent2>
+        <a:srgbClr val="ED7D31"/>
+      </a:accent2>
+      <a:accent3>
+        <a:srgbClr val="A5A5A5"/>
+      </a:accent3>
+      <a:accent4>
+        <a:srgbClr val="FFC000"/>
+      </a:accent4>
+      <a:accent5>
+        <a:srgbClr val="5B9BD5"/>
+      </a:accent5>
+      <a:accent6>
+        <a:srgbClr val="70AD47"/>
+      </a:accent6>
+      <a:hlink>
+        <a:srgbClr val="0563C1"/>
+      </a:hlink>
+      <a:folHlink>
+        <a:srgbClr val="954F72"/>
+      </a:folHlink>
+    </a:clrScheme>
+    <a:fontScheme name="Office">
+      <a:majorFont>
+        <a:latin typeface="Calibri Light" panose="020F0302020204030204"/>
+        <a:ea typeface=""/>
+        <a:cs typeface=""/>
+        <a:font script="Jpan" typeface="游ゴシック Light"/>
+        <a:font script="Hang" typeface="맑은 고딕"/>
+        <a:font script="Hans" typeface="等线 Light"/>
+        <a:font script="Hant" typeface="新細明體"/>
+        <a:font script="Arab" typeface="Times New Roman"/>
+        <a:font script="Hebr" typeface="Times New Roman"/>
+        <a:font script="Thai" typeface="Angsana New"/>
+        <a:font script="Ethi" typeface="Nyala"/>
+        <a:font script="Beng" typeface="Vrinda"/>
+        <a:font script="Gujr" typeface="Shruti"/>
+        <a:font script="Khmr" typeface="MoolBoran"/>
+        <a:font script="Knda" typeface="Tunga"/>
+        <a:font script="Guru" typeface="Raavi"/>
+        <a:font script="Cans" typeface="Euphemia"/>
+        <a:font script="Cher" typeface="Plantagenet Cherokee"/>
+        <a:font script="Yiii" typeface="Microsoft Yi Baiti"/>
+        <a:font script="Tibt" typeface="Microsoft Himalaya"/>
+        <a:font script="Thaa" typeface="MV Boli"/>
+        <a:font script="Deva" typeface="Mangal"/>
+        <a:font script="Telu" typeface="Gautami"/>
+        <a:font script="Taml" typeface="Latha"/>
+        <a:font script="Syrc" typeface="Estrangelo Edessa"/>
+        <a:font script="Orya" typeface="Kalinga"/>
+        <a:font script="Mlym" typeface="Kartika"/>
+        <a:font script="Laoo" typeface="DokChampa"/>
+        <a:font script="Sinh" typeface="Iskoola Pota"/>
+        <a:font script="Mong" typeface="Mongolian Baiti"/>
+        <a:font script="Viet" typeface="Times New Roman"/>
+        <a:font script="Uigh" typeface="Microsoft Uighur"/>
+        <a:font script="Geor" typeface="Sylfaen"/>
+        <a:font script="Armn" typeface="Arial"/>
+        <a:font script="Bugi" typeface="Leelawadee UI"/>
+        <a:font script="Bopo" typeface="Microsoft JhengHei"/>
+        <a:font script="Java" typeface="Javanese Text"/>
+        <a:font script="Lisu" typeface="Segoe UI"/>
+        <a:font script="Mymr" typeface="Myanmar Text"/>
+        <a:font script="Nkoo" typeface="Ebrima"/>
+        <a:font script="Olck" typeface="Nirmala UI"/>
+        <a:font script="Osma" typeface="Ebrima"/>
+        <a:font script="Phag" typeface="Phagspa"/>
+        <a:font script="Syrn" typeface="Estrangelo Edessa"/>
+        <a:font script="Syrj" typeface="Estrangelo Edessa"/>
+        <a:font script="Syre" typeface="Estrangelo Edessa"/>
+        <a:font script="Sora" typeface="Nirmala UI"/>
+        <a:font script="Tale" typeface="Microsoft Tai Le"/>
+        <a:font script="Talu" typeface="Microsoft New Tai Lue"/>
+        <a:font script="Tfng" typeface="Ebrima"/>
+      </a:majorFont>
+      <a:minorFont>
+        <a:latin typeface="Calibri" panose="020F0502020204030204"/>
+        <a:ea typeface=""/>
+        <a:cs typeface=""/>
+        <a:font script="Jpan" typeface="游明朝"/>
+        <a:font script="Hang" typeface="맑은 고딕"/>
+        <a:font script="Hans" typeface="等线"/>
+        <a:font script="Hant" typeface="新細明體"/>
+        <a:font script="Arab" typeface="Arial"/>
+        <a:font script="Hebr" typeface="Arial"/>
+        <a:font script="Thai" typeface="Cordia New"/>
+        <a:font script="Ethi" typeface="Nyala"/>
+        <a:font script="Beng" typeface="Vrinda"/>
+        <a:font script="Gujr" typeface="Shruti"/>
+        <a:font script="Khmr" typeface="DaunPenh"/>
+        <a:font script="Knda" typeface="Tunga"/>
+        <a:font script="Guru" typeface="Raavi"/>
+        <a:font script="Cans" typeface="Euphemia"/>
+        <a:font script="Cher" typeface="Plantagenet Cherokee"/>
+        <a:font script="Yiii" typeface="Microsoft Yi Baiti"/>
+        <a:font script="Tibt" typeface="Microsoft Himalaya"/>
+        <a:font script="Thaa" typeface="MV Boli"/>
+        <a:font script="Deva" typeface="Mangal"/>
+        <a:font script="Telu" typeface="Gautami"/>
+        <a:font script="Taml" typeface="Latha"/>
+        <a:font script="Syrc" typeface="Estrangelo Edessa"/>
+        <a:font script="Orya" typeface="Kalinga"/>
+        <a:font script="Mlym" typeface="Kartika"/>
+        <a:font script="Laoo" typeface="DokChampa"/>
+        <a:font script="Sinh" typeface="Iskoola Pota"/>
+        <a:font script="Mong" typeface="Mongolian Baiti"/>
+        <a:font script="Viet" typeface="Arial"/>
+        <a:font script="Uigh" typeface="Microsoft Uighur"/>
+        <a:font script="Geor" typeface="Sylfaen"/>
+        <a:font script="Armn" typeface="Arial"/>
+        <a:font script="Bugi" typeface="Leelawadee UI"/>
+        <a:font script="Bopo" typeface="Microsoft JhengHei"/>
+        <a:font script="Java" typeface="Javanese Text"/>
+        <a:font script="Lisu" typeface="Segoe UI"/>
+        <a:font script="Mymr" typeface="Myanmar Text"/>
+        <a:font script="Nkoo" typeface="Ebrima"/>
+        <a:font script="Olck" typeface="Nirmala UI"/>
+        <a:font script="Osma" typeface="Ebrima"/>
+        <a:font script="Phag" typeface="Phagspa"/>
+        <a:font script="Syrn" typeface="Estrangelo Edessa"/>
+        <a:font script="Syrj" typeface="Estrangelo Edessa"/>
+        <a:font script="Syre" typeface="Estrangelo Edessa"/>
+        <a:font script="Sora" typeface="Nirmala UI"/>
+        <a:font script="Tale" typeface="Microsoft Tai Le"/>
+        <a:font script="Talu" typeface="Microsoft New Tai Lue"/>
+        <a:font script="Tfng" typeface="Ebrima"/>
+      </a:minorFont>
+    </a:fontScheme>
+    <a:fmtScheme name="Office">
+      <a:fillStyleLst>
+        <a:solidFill>
+          <a:schemeClr val="phClr"/>
+        </a:solidFill>
+        <a:gradFill rotWithShape="true">
+          <a:gsLst>
+            <a:gs pos="0">
+              <a:schemeClr val="phClr">
+                <a:lumMod val="110000"/>
+                <a:satMod val="105000"/>
+                <a:tint val="67000"/>
+              </a:schemeClr>
+            </a:gs>
+            <a:gs pos="50000">
+              <a:schemeClr val="phClr">
+                <a:lumMod val="105000"/>
+                <a:satMod val="103000"/>
+                <a:tint val="73000"/>
+              </a:schemeClr>
+            </a:gs>
+            <a:gs pos="100000">
+              <a:schemeClr val="phClr">
+                <a:lumMod val="105000"/>
+                <a:satMod val="109000"/>
+                <a:tint val="81000"/>
+              </a:schemeClr>
+            </a:gs>
+          </a:gsLst>
+          <a:lin ang="5400000" scaled="false"/>
+        </a:gradFill>
+        <a:gradFill rotWithShape="true">
+          <a:gsLst>
+            <a:gs pos="0">
+              <a:schemeClr val="phClr">
+                <a:satMod val="103000"/>
+                <a:lumMod val="102000"/>
+                <a:tint val="94000"/>
+              </a:schemeClr>
+            </a:gs>
+            <a:gs pos="50000">
+              <a:schemeClr val="phClr">
+                <a:satMod val="110000"/>
+                <a:lumMod val="100000"/>
+                <a:shade val="100000"/>
+              </a:schemeClr>
+            </a:gs>
+            <a:gs pos="100000">
+              <a:schemeClr val="phClr">
+                <a:lumMod val="99000"/>
+                <a:satMod val="120000"/>
+                <a:shade val="78000"/>
+              </a:schemeClr>
+            </a:gs>
+          </a:gsLst>
+          <a:lin ang="5400000" scaled="false"/>
+        </a:gradFill>
+      </a:fillStyleLst>
+      <a:lnStyleLst>
+        <a:ln w="6350" cap="flat" cmpd="sng" algn="ctr">
+          <a:solidFill>
+            <a:schemeClr val="phClr"/>
+          </a:solidFill>
+          <a:prstDash val="solid"/>
+          <a:miter lim="800000"/>
+        </a:ln>
+        <a:ln w="12700" cap="flat" cmpd="sng" algn="ctr">
+          <a:solidFill>
+            <a:schemeClr val="phClr"/>
+          </a:solidFill>
+          <a:prstDash val="solid"/>
+          <a:miter lim="800000"/>
+        </a:ln>
+        <a:ln w="19050" cap="flat" cmpd="sng" algn="ctr">
+          <a:solidFill>
+            <a:schemeClr val="phClr"/>
+          </a:solidFill>
+          <a:prstDash val="solid"/>
+          <a:miter lim="800000"/>
+        </a:ln>
+      </a:lnStyleLst>
+      <a:effectStyleLst>
+        <a:effectStyle>
+          <a:effectLst/>
+        </a:effectStyle>
+        <a:effectStyle>
+          <a:effectLst/>
+        </a:effectStyle>
+        <a:effectStyle>
+          <a:effectLst>
+            <a:outerShdw blurRad="57150" dist="19050" dir="5400000" algn="ctr" rotWithShape="false">
+              <a:srgbClr val="000000">
+                <a:alpha val="63000"/>
+              </a:srgbClr>
+            </a:outerShdw>
+          </a:effectLst>
+        </a:effectStyle>
+      </a:effectStyleLst>
+      <a:bgFillStyleLst>
+        <a:solidFill>
+          <a:schemeClr val="phClr"/>
+        </a:solidFill>
+        <a:solidFill>
+          <a:schemeClr val="phClr">
+            <a:tint val="95000"/>
+            <a:satMod val="170000"/>
+          </a:schemeClr>
+        </a:solidFill>
+        <a:gradFill rotWithShape="true">
+          <a:gsLst>
+            <a:gs pos="0">
+              <a:schemeClr val="phClr">
+                <a:tint val="93000"/>
+                <a:satMod val="150000"/>
+                <a:shade val="98000"/>
+                <a:lumMod val="102000"/>
+              </a:schemeClr>
+            </a:gs>
+            <a:gs pos="50000">
+              <a:schemeClr val="phClr">
+                <a:tint val="98000"/>
+                <a:satMod val="130000"/>
+                <a:shade val="90000"/>
+                <a:lumMod val="103000"/>
+              </a:schemeClr>
+            </a:gs>
+            <a:gs pos="100000">
+              <a:schemeClr val="phClr">
+                <a:shade val="63000"/>
+                <a:satMod val="120000"/>
+              </a:schemeClr>
+            </a:gs>
+          </a:gsLst>
+          <a:lin ang="5400000" scaled="false"/>
+        </a:gradFill>
+      </a:bgFillStyleLst>
+    </a:fmtScheme>
+  </a:themeElements>
+  <a:objectDefaults/>
+  <a:extraClrSchemeLst/>
+</a:theme>
 </file>
</xml_diff>

<commit_message>
Aire Express: lección 14 'Tus herramientas', contrato en PDF y fotos al grupo de WhatsApp (28-oct)
Co-Authored-By: Claude Opus 5.5 <noreply@anthropic.com>
</commit_message>
<xml_diff>
--- a/induccion-aire-express/guiones/docs/00_LEEME_PRIMERO.docx
+++ b/induccion-aire-express/guiones/docs/00_LEEME_PRIMERO.docx
@@ -98,9 +98,9 @@
         </w:tblBorders>
       </w:tblPr>
       <w:tblGrid>
-        <w:gridCol w:w="1507"/>
-        <w:gridCol w:w="3630"/>
-        <w:gridCol w:w="4835"/>
+        <w:gridCol w:w="1466"/>
+        <w:gridCol w:w="3493"/>
+        <w:gridCol w:w="5013"/>
       </w:tblGrid>
       <w:tr>
         <w:trPr>
@@ -108,7 +108,7 @@
         </w:trPr>
         <w:tc>
           <w:tcPr>
-            <w:tcW w:type="dxa" w:w="1507"/>
+            <w:tcW w:type="dxa" w:w="1466"/>
             <w:tcBorders>
               <w:top w:val="single" w:color="CCCCCC" w:sz="1"/>
               <w:left w:val="single" w:color="CCCCCC" w:sz="1"/>
@@ -143,7 +143,7 @@
         </w:tc>
         <w:tc>
           <w:tcPr>
-            <w:tcW w:type="dxa" w:w="3630"/>
+            <w:tcW w:type="dxa" w:w="3493"/>
             <w:tcBorders>
               <w:top w:val="single" w:color="CCCCCC" w:sz="1"/>
               <w:left w:val="single" w:color="CCCCCC" w:sz="1"/>
@@ -178,7 +178,7 @@
         </w:tc>
         <w:tc>
           <w:tcPr>
-            <w:tcW w:type="dxa" w:w="4835"/>
+            <w:tcW w:type="dxa" w:w="5013"/>
             <w:tcBorders>
               <w:top w:val="single" w:color="CCCCCC" w:sz="1"/>
               <w:left w:val="single" w:color="CCCCCC" w:sz="1"/>
@@ -218,7 +218,7 @@
         </w:trPr>
         <w:tc>
           <w:tcPr>
-            <w:tcW w:type="dxa" w:w="1507"/>
+            <w:tcW w:type="dxa" w:w="1466"/>
             <w:tcBorders>
               <w:top w:val="single" w:color="CCCCCC" w:sz="1"/>
               <w:left w:val="single" w:color="CCCCCC" w:sz="1"/>
@@ -250,7 +250,7 @@
         </w:tc>
         <w:tc>
           <w:tcPr>
-            <w:tcW w:type="dxa" w:w="3630"/>
+            <w:tcW w:type="dxa" w:w="3493"/>
             <w:tcBorders>
               <w:top w:val="single" w:color="CCCCCC" w:sz="1"/>
               <w:left w:val="single" w:color="CCCCCC" w:sz="1"/>
@@ -293,7 +293,7 @@
         </w:tc>
         <w:tc>
           <w:tcPr>
-            <w:tcW w:type="dxa" w:w="4835"/>
+            <w:tcW w:type="dxa" w:w="5013"/>
             <w:tcBorders>
               <w:top w:val="single" w:color="CCCCCC" w:sz="1"/>
               <w:left w:val="single" w:color="CCCCCC" w:sz="1"/>
@@ -319,7 +319,7 @@
                 <w:sz w:val="17"/>
                 <w:szCs w:val="17"/>
               </w:rPr>
-              <w:t xml:space="preserve">La escuela completa (15 pestañas, con fotos del CRM y videos). Se abre en el celular o en el computador; arriba a la derecha cambias a inglés. Copia sin internet: </w:t>
+              <w:t xml:space="preserve">La escuela completa (18 pestañas, con fotos del CRM y videos; la lección 14 es "Tus herramientas"). Se abre en el celular o en el computador; arriba a la derecha cambias a inglés. Copia sin internet: </w:t>
             </w:r>
             <w:r>
               <w:rPr>
@@ -348,7 +348,7 @@
         </w:trPr>
         <w:tc>
           <w:tcPr>
-            <w:tcW w:type="dxa" w:w="1507"/>
+            <w:tcW w:type="dxa" w:w="1466"/>
             <w:tcBorders>
               <w:top w:val="single" w:color="CCCCCC" w:sz="1"/>
               <w:left w:val="single" w:color="CCCCCC" w:sz="1"/>
@@ -380,7 +380,7 @@
         </w:tc>
         <w:tc>
           <w:tcPr>
-            <w:tcW w:type="dxa" w:w="3630"/>
+            <w:tcW w:type="dxa" w:w="3493"/>
             <w:tcBorders>
               <w:top w:val="single" w:color="CCCCCC" w:sz="1"/>
               <w:left w:val="single" w:color="CCCCCC" w:sz="1"/>
@@ -412,7 +412,7 @@
         </w:tc>
         <w:tc>
           <w:tcPr>
-            <w:tcW w:type="dxa" w:w="4835"/>
+            <w:tcW w:type="dxa" w:w="5013"/>
             <w:tcBorders>
               <w:top w:val="single" w:color="CCCCCC" w:sz="1"/>
               <w:left w:val="single" w:color="CCCCCC" w:sz="1"/>
@@ -449,7 +449,7 @@
         </w:trPr>
         <w:tc>
           <w:tcPr>
-            <w:tcW w:type="dxa" w:w="1507"/>
+            <w:tcW w:type="dxa" w:w="1466"/>
             <w:tcBorders>
               <w:top w:val="single" w:color="CCCCCC" w:sz="1"/>
               <w:left w:val="single" w:color="CCCCCC" w:sz="1"/>
@@ -481,7 +481,7 @@
         </w:tc>
         <w:tc>
           <w:tcPr>
-            <w:tcW w:type="dxa" w:w="3630"/>
+            <w:tcW w:type="dxa" w:w="3493"/>
             <w:tcBorders>
               <w:top w:val="single" w:color="CCCCCC" w:sz="1"/>
               <w:left w:val="single" w:color="CCCCCC" w:sz="1"/>
@@ -513,7 +513,7 @@
         </w:tc>
         <w:tc>
           <w:tcPr>
-            <w:tcW w:type="dxa" w:w="4835"/>
+            <w:tcW w:type="dxa" w:w="5013"/>
             <w:tcBorders>
               <w:top w:val="single" w:color="CCCCCC" w:sz="1"/>
               <w:left w:val="single" w:color="CCCCCC" w:sz="1"/>
@@ -550,7 +550,7 @@
         </w:trPr>
         <w:tc>
           <w:tcPr>
-            <w:tcW w:type="dxa" w:w="1507"/>
+            <w:tcW w:type="dxa" w:w="1466"/>
             <w:tcBorders>
               <w:top w:val="single" w:color="CCCCCC" w:sz="1"/>
               <w:left w:val="single" w:color="CCCCCC" w:sz="1"/>
@@ -582,7 +582,7 @@
         </w:tc>
         <w:tc>
           <w:tcPr>
-            <w:tcW w:type="dxa" w:w="3630"/>
+            <w:tcW w:type="dxa" w:w="3493"/>
             <w:tcBorders>
               <w:top w:val="single" w:color="CCCCCC" w:sz="1"/>
               <w:left w:val="single" w:color="CCCCCC" w:sz="1"/>
@@ -614,7 +614,7 @@
         </w:tc>
         <w:tc>
           <w:tcPr>
-            <w:tcW w:type="dxa" w:w="4835"/>
+            <w:tcW w:type="dxa" w:w="5013"/>
             <w:tcBorders>
               <w:top w:val="single" w:color="CCCCCC" w:sz="1"/>
               <w:left w:val="single" w:color="CCCCCC" w:sz="1"/>
@@ -651,7 +651,7 @@
         </w:trPr>
         <w:tc>
           <w:tcPr>
-            <w:tcW w:type="dxa" w:w="1507"/>
+            <w:tcW w:type="dxa" w:w="1466"/>
             <w:tcBorders>
               <w:top w:val="single" w:color="CCCCCC" w:sz="1"/>
               <w:left w:val="single" w:color="CCCCCC" w:sz="1"/>
@@ -683,7 +683,7 @@
         </w:tc>
         <w:tc>
           <w:tcPr>
-            <w:tcW w:type="dxa" w:w="3630"/>
+            <w:tcW w:type="dxa" w:w="3493"/>
             <w:tcBorders>
               <w:top w:val="single" w:color="CCCCCC" w:sz="1"/>
               <w:left w:val="single" w:color="CCCCCC" w:sz="1"/>
@@ -715,7 +715,7 @@
         </w:tc>
         <w:tc>
           <w:tcPr>
-            <w:tcW w:type="dxa" w:w="4835"/>
+            <w:tcW w:type="dxa" w:w="5013"/>
             <w:tcBorders>
               <w:top w:val="single" w:color="CCCCCC" w:sz="1"/>
               <w:left w:val="single" w:color="CCCCCC" w:sz="1"/>
@@ -772,7 +772,7 @@
         </w:trPr>
         <w:tc>
           <w:tcPr>
-            <w:tcW w:type="dxa" w:w="1507"/>
+            <w:tcW w:type="dxa" w:w="1466"/>
             <w:tcBorders>
               <w:top w:val="single" w:color="CCCCCC" w:sz="1"/>
               <w:left w:val="single" w:color="CCCCCC" w:sz="1"/>
@@ -804,7 +804,7 @@
         </w:tc>
         <w:tc>
           <w:tcPr>
-            <w:tcW w:type="dxa" w:w="3630"/>
+            <w:tcW w:type="dxa" w:w="3493"/>
             <w:tcBorders>
               <w:top w:val="single" w:color="CCCCCC" w:sz="1"/>
               <w:left w:val="single" w:color="CCCCCC" w:sz="1"/>
@@ -836,7 +836,7 @@
         </w:tc>
         <w:tc>
           <w:tcPr>
-            <w:tcW w:type="dxa" w:w="4835"/>
+            <w:tcW w:type="dxa" w:w="5013"/>
             <w:tcBorders>
               <w:top w:val="single" w:color="CCCCCC" w:sz="1"/>
               <w:left w:val="single" w:color="CCCCCC" w:sz="1"/>
@@ -873,7 +873,7 @@
         </w:trPr>
         <w:tc>
           <w:tcPr>
-            <w:tcW w:type="dxa" w:w="1507"/>
+            <w:tcW w:type="dxa" w:w="1466"/>
             <w:tcBorders>
               <w:top w:val="single" w:color="CCCCCC" w:sz="1"/>
               <w:left w:val="single" w:color="CCCCCC" w:sz="1"/>
@@ -899,20 +899,121 @@
                 <w:sz w:val="17"/>
                 <w:szCs w:val="17"/>
               </w:rPr>
+              <w:t xml:space="preserve">7</w:t>
+            </w:r>
+          </w:p>
+        </w:tc>
+        <w:tc>
+          <w:tcPr>
+            <w:tcW w:type="dxa" w:w="3493"/>
+            <w:tcBorders>
+              <w:top w:val="single" w:color="CCCCCC" w:sz="1"/>
+              <w:left w:val="single" w:color="CCCCCC" w:sz="1"/>
+              <w:bottom w:val="single" w:color="CCCCCC" w:sz="1"/>
+              <w:right w:val="single" w:color="CCCCCC" w:sz="1"/>
+            </w:tcBorders>
+            <w:shd w:fill="F7F8FA" w:val="clear"/>
+            <w:tcMar>
+              <w:top w:type="dxa" w:w="70"/>
+              <w:left w:type="dxa" w:w="100"/>
+              <w:bottom w:type="dxa" w:w="70"/>
+              <w:right w:type="dxa" w:w="100"/>
+            </w:tcMar>
+          </w:tcPr>
+          <w:p>
+            <w:pPr>
+              <w:spacing w:after="0"/>
+            </w:pPr>
+            <w:r>
+              <w:rPr>
+                <w:rFonts w:ascii="Courier New" w:cs="Courier New" w:eastAsia="Courier New" w:hAnsi="Courier New"/>
+                <w:color w:val="333333"/>
+                <w:sz w:val="15"/>
+                <w:szCs w:val="15"/>
+              </w:rPr>
+              <w:t xml:space="preserve">03_PROCESO_DE_HERRAMIENTAS.docx</w:t>
+            </w:r>
+          </w:p>
+        </w:tc>
+        <w:tc>
+          <w:tcPr>
+            <w:tcW w:type="dxa" w:w="5013"/>
+            <w:tcBorders>
+              <w:top w:val="single" w:color="CCCCCC" w:sz="1"/>
+              <w:left w:val="single" w:color="CCCCCC" w:sz="1"/>
+              <w:bottom w:val="single" w:color="CCCCCC" w:sz="1"/>
+              <w:right w:val="single" w:color="CCCCCC" w:sz="1"/>
+            </w:tcBorders>
+            <w:shd w:fill="F7F8FA" w:val="clear"/>
+            <w:tcMar>
+              <w:top w:type="dxa" w:w="70"/>
+              <w:left w:type="dxa" w:w="100"/>
+              <w:bottom w:type="dxa" w:w="70"/>
+              <w:right w:type="dxa" w:w="100"/>
+            </w:tcMar>
+          </w:tcPr>
+          <w:p>
+            <w:pPr>
+              <w:spacing w:after="0"/>
+            </w:pPr>
+            <w:r>
+              <w:rPr>
+                <w:rFonts w:ascii="Arial" w:cs="Arial" w:eastAsia="Arial" w:hAnsi="Arial"/>
+                <w:color w:val="333333"/>
+                <w:sz w:val="17"/>
+                <w:szCs w:val="17"/>
+              </w:rPr>
+              <w:t xml:space="preserve">Qué herramienta usas para cada cosa, tu día herramienta por herramienta, las fotos del furnace al grupo y el contrato en PDF.</w:t>
+            </w:r>
+          </w:p>
+        </w:tc>
+      </w:tr>
+      <w:tr>
+        <w:trPr>
+          <w:cantSplit/>
+        </w:trPr>
+        <w:tc>
+          <w:tcPr>
+            <w:tcW w:type="dxa" w:w="1466"/>
+            <w:tcBorders>
+              <w:top w:val="single" w:color="CCCCCC" w:sz="1"/>
+              <w:left w:val="single" w:color="CCCCCC" w:sz="1"/>
+              <w:bottom w:val="single" w:color="CCCCCC" w:sz="1"/>
+              <w:right w:val="single" w:color="CCCCCC" w:sz="1"/>
+            </w:tcBorders>
+            <w:shd w:fill="FFFFFF" w:val="clear"/>
+            <w:tcMar>
+              <w:top w:type="dxa" w:w="70"/>
+              <w:left w:type="dxa" w:w="100"/>
+              <w:bottom w:type="dxa" w:w="70"/>
+              <w:right w:type="dxa" w:w="100"/>
+            </w:tcMar>
+          </w:tcPr>
+          <w:p>
+            <w:pPr>
+              <w:spacing w:after="0"/>
+            </w:pPr>
+            <w:r>
+              <w:rPr>
+                <w:rFonts w:ascii="Arial" w:cs="Arial" w:eastAsia="Arial" w:hAnsi="Arial"/>
+                <w:color w:val="333333"/>
+                <w:sz w:val="17"/>
+                <w:szCs w:val="17"/>
+              </w:rPr>
               <w:t xml:space="preserve">—</w:t>
             </w:r>
           </w:p>
         </w:tc>
         <w:tc>
           <w:tcPr>
-            <w:tcW w:type="dxa" w:w="3630"/>
-            <w:tcBorders>
-              <w:top w:val="single" w:color="CCCCCC" w:sz="1"/>
-              <w:left w:val="single" w:color="CCCCCC" w:sz="1"/>
-              <w:bottom w:val="single" w:color="CCCCCC" w:sz="1"/>
-              <w:right w:val="single" w:color="CCCCCC" w:sz="1"/>
-            </w:tcBorders>
-            <w:shd w:fill="F7F8FA" w:val="clear"/>
+            <w:tcW w:type="dxa" w:w="3493"/>
+            <w:tcBorders>
+              <w:top w:val="single" w:color="CCCCCC" w:sz="1"/>
+              <w:left w:val="single" w:color="CCCCCC" w:sz="1"/>
+              <w:bottom w:val="single" w:color="CCCCCC" w:sz="1"/>
+              <w:right w:val="single" w:color="CCCCCC" w:sz="1"/>
+            </w:tcBorders>
+            <w:shd w:fill="FFFFFF" w:val="clear"/>
             <w:tcMar>
               <w:top w:type="dxa" w:w="70"/>
               <w:left w:type="dxa" w:w="100"/>
@@ -937,14 +1038,14 @@
         </w:tc>
         <w:tc>
           <w:tcPr>
-            <w:tcW w:type="dxa" w:w="4835"/>
-            <w:tcBorders>
-              <w:top w:val="single" w:color="CCCCCC" w:sz="1"/>
-              <w:left w:val="single" w:color="CCCCCC" w:sz="1"/>
-              <w:bottom w:val="single" w:color="CCCCCC" w:sz="1"/>
-              <w:right w:val="single" w:color="CCCCCC" w:sz="1"/>
-            </w:tcBorders>
-            <w:shd w:fill="F7F8FA" w:val="clear"/>
+            <w:tcW w:type="dxa" w:w="5013"/>
+            <w:tcBorders>
+              <w:top w:val="single" w:color="CCCCCC" w:sz="1"/>
+              <w:left w:val="single" w:color="CCCCCC" w:sz="1"/>
+              <w:bottom w:val="single" w:color="CCCCCC" w:sz="1"/>
+              <w:right w:val="single" w:color="CCCCCC" w:sz="1"/>
+            </w:tcBorders>
+            <w:shd w:fill="FFFFFF" w:val="clear"/>
             <w:tcMar>
               <w:top w:type="dxa" w:w="70"/>
               <w:left w:type="dxa" w:w="100"/>
@@ -2719,8 +2820,8 @@
       </w:r>
     </w:p>
     <w:sectPr>
-      <w:headerReference w:type="default" r:id="rId6"/>
-      <w:footerReference w:type="default" r:id="rId7"/>
+      <w:headerReference w:type="default" r:id="rId7"/>
+      <w:footerReference w:type="default" r:id="rId8"/>
       <w:pgSz w:w="12240" w:h="15840" w:orient="portrait"/>
       <w:pgMar w:top="1134" w:right="1134" w:bottom="1134" w:left="1134" w:header="708" w:footer="708" w:gutter="0"/>
       <w:pgNumType/>
@@ -2728,6 +2829,10 @@
     </w:sectPr>
   </w:body>
 </w:document>
+</file>
+
+<file path=word/comments.xml><?xml version="1.0" encoding="utf-8"?>
+<w:comments xmlns:cx="http://schemas.microsoft.com/office/drawing/2014/chartex" xmlns:cx1="http://schemas.microsoft.com/office/drawing/2015/9/8/chartex" xmlns:cx2="http://schemas.microsoft.com/office/drawing/2015/10/21/chartex" xmlns:cx3="http://schemas.microsoft.com/office/drawing/2016/5/9/chartex" xmlns:cx4="http://schemas.microsoft.com/office/drawing/2016/5/10/chartex" xmlns:cx5="http://schemas.microsoft.com/office/drawing/2016/5/11/chartex" xmlns:cx6="http://schemas.microsoft.com/office/drawing/2016/5/12/chartex" xmlns:cx7="http://schemas.microsoft.com/office/drawing/2016/5/13/chartex" xmlns:cx8="http://schemas.microsoft.com/office/drawing/2016/5/14/chartex" xmlns:mc="http://schemas.openxmlformats.org/markup-compatibility/2006" xmlns:aink="http://schemas.microsoft.com/office/drawing/2016/ink" xmlns:am3d="http://schemas.microsoft.com/office/drawing/2017/model3d" xmlns:o="urn:schemas-microsoft-com:office:office" xmlns:r="http://schemas.openxmlformats.org/officeDocument/2006/relationships" xmlns:m="http://schemas.openxmlformats.org/officeDocument/2006/math" xmlns:v="urn:schemas-microsoft-com:vml" xmlns:wp14="http://schemas.microsoft.com/office/word/2010/wordprocessingDrawing" xmlns:wp="http://schemas.openxmlformats.org/drawingml/2006/wordprocessingDrawing" xmlns:w10="urn:schemas-microsoft-com:office:word" xmlns:w="http://schemas.openxmlformats.org/wordprocessingml/2006/main" xmlns:w14="http://schemas.microsoft.com/office/word/2010/wordml" xmlns:w15="http://schemas.microsoft.com/office/word/2012/wordml" xmlns:w16cex="http://schemas.microsoft.com/office/word/2018/wordml/cex" xmlns:w16cid="http://schemas.microsoft.com/office/word/2016/wordml/cid" xmlns:w16="http://schemas.microsoft.com/office/word/2018/wordml" xmlns:w16sdtdh="http://schemas.microsoft.com/office/word/2020/wordml/sdtdatahash" xmlns:w16se="http://schemas.microsoft.com/office/word/2015/wordml/symex" xmlns:wpg="http://schemas.microsoft.com/office/word/2010/wordprocessingGroup" xmlns:wpi="http://schemas.microsoft.com/office/word/2010/wordprocessingInk" xmlns:wne="http://schemas.microsoft.com/office/word/2006/wordml" xmlns:wps="http://schemas.microsoft.com/office/word/2010/wordprocessingShape"/>
 </file>
 
 <file path=word/endnotes.xml><?xml version="1.0" encoding="utf-8"?>
@@ -2794,32 +2899,8 @@
         <w:szCs w:val="16"/>
       </w:rPr>
       <w:fldChar w:fldCharType="begin"/>
-    </w:r>
-    <w:r>
-      <w:rPr>
-        <w:rFonts w:ascii="Arial" w:cs="Arial" w:eastAsia="Arial" w:hAnsi="Arial"/>
-        <w:color w:val="666666"/>
-        <w:sz w:val="16"/>
-        <w:szCs w:val="16"/>
-      </w:rPr>
       <w:instrText xml:space="preserve">PAGE</w:instrText>
-    </w:r>
-    <w:r>
-      <w:rPr>
-        <w:rFonts w:ascii="Arial" w:cs="Arial" w:eastAsia="Arial" w:hAnsi="Arial"/>
-        <w:color w:val="666666"/>
-        <w:sz w:val="16"/>
-        <w:szCs w:val="16"/>
-      </w:rPr>
       <w:fldChar w:fldCharType="separate"/>
-    </w:r>
-    <w:r>
-      <w:rPr>
-        <w:rFonts w:ascii="Arial" w:cs="Arial" w:eastAsia="Arial" w:hAnsi="Arial"/>
-        <w:color w:val="666666"/>
-        <w:sz w:val="16"/>
-        <w:szCs w:val="16"/>
-      </w:rPr>
       <w:fldChar w:fldCharType="end"/>
     </w:r>
     <w:r>
@@ -2839,32 +2920,8 @@
         <w:szCs w:val="16"/>
       </w:rPr>
       <w:fldChar w:fldCharType="begin"/>
-    </w:r>
-    <w:r>
-      <w:rPr>
-        <w:rFonts w:ascii="Arial" w:cs="Arial" w:eastAsia="Arial" w:hAnsi="Arial"/>
-        <w:color w:val="666666"/>
-        <w:sz w:val="16"/>
-        <w:szCs w:val="16"/>
-      </w:rPr>
       <w:instrText xml:space="preserve">NUMPAGES</w:instrText>
-    </w:r>
-    <w:r>
-      <w:rPr>
-        <w:rFonts w:ascii="Arial" w:cs="Arial" w:eastAsia="Arial" w:hAnsi="Arial"/>
-        <w:color w:val="666666"/>
-        <w:sz w:val="16"/>
-        <w:szCs w:val="16"/>
-      </w:rPr>
       <w:fldChar w:fldCharType="separate"/>
-    </w:r>
-    <w:r>
-      <w:rPr>
-        <w:rFonts w:ascii="Arial" w:cs="Arial" w:eastAsia="Arial" w:hAnsi="Arial"/>
-        <w:color w:val="666666"/>
-        <w:sz w:val="16"/>
-        <w:szCs w:val="16"/>
-      </w:rPr>
       <w:fldChar w:fldCharType="end"/>
     </w:r>
   </w:p>
@@ -2935,7 +2992,7 @@
         <w:sz w:val="16"/>
         <w:szCs w:val="16"/>
       </w:rPr>
-      <w:t xml:space="preserve">   |   Inducción · Angélica León</w:t>
+      <w:t xml:space="preserve">   |   Inducción comercial</w:t>
     </w:r>
   </w:p>
 </w:hdr>
@@ -2945,7 +3002,7 @@
 <w:numbering xmlns:wpc="http://schemas.microsoft.com/office/word/2010/wordprocessingCanvas" xmlns:mc="http://schemas.openxmlformats.org/markup-compatibility/2006" xmlns:o="urn:schemas-microsoft-com:office:office" xmlns:r="http://schemas.openxmlformats.org/officeDocument/2006/relationships" xmlns:m="http://schemas.openxmlformats.org/officeDocument/2006/math" xmlns:v="urn:schemas-microsoft-com:vml" xmlns:wp14="http://schemas.microsoft.com/office/word/2010/wordprocessingDrawing" xmlns:wp="http://schemas.openxmlformats.org/drawingml/2006/wordprocessingDrawing" xmlns:w10="urn:schemas-microsoft-com:office:word" xmlns:w="http://schemas.openxmlformats.org/wordprocessingml/2006/main" xmlns:w14="http://schemas.microsoft.com/office/word/2010/wordml" xmlns:w15="http://schemas.microsoft.com/office/word/2012/wordml" xmlns:wpg="http://schemas.microsoft.com/office/word/2010/wordprocessingGroup" xmlns:wpi="http://schemas.microsoft.com/office/word/2010/wordprocessingInk" xmlns:wne="http://schemas.microsoft.com/office/word/2006/wordml" xmlns:wps="http://schemas.microsoft.com/office/word/2010/wordprocessingShape" mc:Ignorable="w14 w15 wp14">
   <w:abstractNum w:abstractNumId="1" w15:restartNumberingAfterBreak="0">
     <w:multiLevelType w:val="hybridMultilevel"/>
-    <w:lvl w:ilvl="0" w:tentative="1">
+    <w:lvl w:ilvl="0" w15:tentative="1">
       <w:start w:val="1"/>
       <w:numFmt w:val="bullet"/>
       <w:lvlText w:val="●"/>
@@ -2954,7 +3011,7 @@
         <w:ind w:left="720" w:hanging="360"/>
       </w:pPr>
     </w:lvl>
-    <w:lvl w:ilvl="1" w:tentative="1">
+    <w:lvl w:ilvl="1" w15:tentative="1">
       <w:start w:val="1"/>
       <w:numFmt w:val="bullet"/>
       <w:lvlText w:val="○"/>
@@ -2963,7 +3020,7 @@
         <w:ind w:left="1440" w:hanging="360"/>
       </w:pPr>
     </w:lvl>
-    <w:lvl w:ilvl="2" w:tentative="1">
+    <w:lvl w:ilvl="2" w15:tentative="1">
       <w:start w:val="1"/>
       <w:numFmt w:val="bullet"/>
       <w:lvlText w:val="■"/>
@@ -2972,7 +3029,7 @@
         <w:ind w:left="2160" w:hanging="360"/>
       </w:pPr>
     </w:lvl>
-    <w:lvl w:ilvl="3" w:tentative="1">
+    <w:lvl w:ilvl="3" w15:tentative="1">
       <w:start w:val="1"/>
       <w:numFmt w:val="bullet"/>
       <w:lvlText w:val="●"/>
@@ -2981,7 +3038,7 @@
         <w:ind w:left="2880" w:hanging="360"/>
       </w:pPr>
     </w:lvl>
-    <w:lvl w:ilvl="4" w:tentative="1">
+    <w:lvl w:ilvl="4" w15:tentative="1">
       <w:start w:val="1"/>
       <w:numFmt w:val="bullet"/>
       <w:lvlText w:val="○"/>
@@ -2990,7 +3047,7 @@
         <w:ind w:left="3600" w:hanging="360"/>
       </w:pPr>
     </w:lvl>
-    <w:lvl w:ilvl="5" w:tentative="1">
+    <w:lvl w:ilvl="5" w15:tentative="1">
       <w:start w:val="1"/>
       <w:numFmt w:val="bullet"/>
       <w:lvlText w:val="■"/>
@@ -2999,7 +3056,7 @@
         <w:ind w:left="4320" w:hanging="360"/>
       </w:pPr>
     </w:lvl>
-    <w:lvl w:ilvl="6" w:tentative="1">
+    <w:lvl w:ilvl="6" w15:tentative="1">
       <w:start w:val="1"/>
       <w:numFmt w:val="bullet"/>
       <w:lvlText w:val="●"/>
@@ -3008,7 +3065,7 @@
         <w:ind w:left="5040" w:hanging="360"/>
       </w:pPr>
     </w:lvl>
-    <w:lvl w:ilvl="7" w:tentative="1">
+    <w:lvl w:ilvl="7" w15:tentative="1">
       <w:start w:val="1"/>
       <w:numFmt w:val="bullet"/>
       <w:lvlText w:val="●"/>
@@ -3017,7 +3074,7 @@
         <w:ind w:left="5760" w:hanging="360"/>
       </w:pPr>
     </w:lvl>
-    <w:lvl w:ilvl="8" w:tentative="1">
+    <w:lvl w:ilvl="8" w15:tentative="1">
       <w:start w:val="1"/>
       <w:numFmt w:val="bullet"/>
       <w:lvlText w:val="●"/>
@@ -3049,25 +3106,6 @@
     </w:rPrDefault>
     <w:pPrDefault/>
   </w:docDefaults>
-  <w:style w:type="paragraph" w:styleId="Normal" w:default="1">
-    <w:name w:val="Normal"/>
-    <w:qFormat/>
-  </w:style>
-  <w:style w:type="table" w:styleId="TableNormal" w:default="true">
-    <w:name w:val="Normal Table"/>
-    <w:uiPriority w:val="99"/>
-    <w:semiHidden/>
-    <w:unhideWhenUsed/>
-    <w:tblPr>
-      <w:tblInd w:type="dxa" w:w="0"/>
-      <w:tblCellMar>
-        <w:top w:type="dxa" w:w="0"/>
-        <w:left w:type="dxa" w:w="108"/>
-        <w:bottom w:type="dxa" w:w="0"/>
-        <w:right w:type="dxa" w:w="108"/>
-      </w:tblCellMar>
-    </w:tblPr>
-  </w:style>
   <w:style w:type="paragraph" w:styleId="Title">
     <w:name w:val="Title"/>
     <w:basedOn w:val="Normal"/>
@@ -3155,139 +3193,6 @@
     <w:basedOn w:val="Normal"/>
     <w:qFormat/>
   </w:style>
-  <w:style w:type="paragraph" w:styleId="Caption">
-    <w:name w:val="caption"/>
-    <w:basedOn w:val="Normal"/>
-    <w:next w:val="Normal"/>
-    <w:uiPriority w:val="35"/>
-    <w:semiHidden/>
-    <w:unhideWhenUsed/>
-    <w:qFormat/>
-    <w:pPr>
-      <w:spacing w:after="200"/>
-    </w:pPr>
-    <w:rPr>
-      <w:i/>
-      <w:iCs/>
-      <w:color w:val="44546A" w:themeColor="dark2"/>
-      <w:sz w:val="18"/>
-      <w:szCs w:val="18"/>
-    </w:rPr>
-  </w:style>
-  <w:style w:type="paragraph" w:styleId="Bibliography">
-    <w:name w:val="Bibliography"/>
-    <w:basedOn w:val="Normal"/>
-    <w:next w:val="Normal"/>
-    <w:uiPriority w:val="37"/>
-    <w:unhideWhenUsed/>
-  </w:style>
-  <w:style w:type="paragraph" w:styleId="TOC1">
-    <w:name w:val="toc 1"/>
-    <w:basedOn w:val="Normal"/>
-    <w:next w:val="Normal"/>
-    <w:uiPriority w:val="39"/>
-    <w:semiHidden/>
-    <w:unhideWhenUsed/>
-    <w:pPr>
-      <w:spacing w:after="100"/>
-    </w:pPr>
-  </w:style>
-  <w:style w:type="paragraph" w:styleId="TOC2">
-    <w:name w:val="toc 2"/>
-    <w:basedOn w:val="Normal"/>
-    <w:next w:val="Normal"/>
-    <w:uiPriority w:val="39"/>
-    <w:semiHidden/>
-    <w:unhideWhenUsed/>
-    <w:pPr>
-      <w:spacing w:after="100"/>
-      <w:ind w:left="200"/>
-    </w:pPr>
-  </w:style>
-  <w:style w:type="paragraph" w:styleId="TOC3">
-    <w:name w:val="toc 3"/>
-    <w:basedOn w:val="Normal"/>
-    <w:next w:val="Normal"/>
-    <w:uiPriority w:val="39"/>
-    <w:semiHidden/>
-    <w:unhideWhenUsed/>
-    <w:pPr>
-      <w:spacing w:after="100"/>
-      <w:ind w:left="400"/>
-    </w:pPr>
-  </w:style>
-  <w:style w:type="paragraph" w:styleId="TOC4">
-    <w:name w:val="toc 4"/>
-    <w:basedOn w:val="Normal"/>
-    <w:next w:val="Normal"/>
-    <w:uiPriority w:val="39"/>
-    <w:semiHidden/>
-    <w:unhideWhenUsed/>
-    <w:pPr>
-      <w:spacing w:after="100"/>
-      <w:ind w:left="600"/>
-    </w:pPr>
-  </w:style>
-  <w:style w:type="paragraph" w:styleId="TOC5">
-    <w:name w:val="toc 5"/>
-    <w:basedOn w:val="Normal"/>
-    <w:next w:val="Normal"/>
-    <w:uiPriority w:val="39"/>
-    <w:semiHidden/>
-    <w:unhideWhenUsed/>
-    <w:pPr>
-      <w:spacing w:after="100"/>
-      <w:ind w:left="800"/>
-    </w:pPr>
-  </w:style>
-  <w:style w:type="paragraph" w:styleId="TOC6">
-    <w:name w:val="toc 6"/>
-    <w:basedOn w:val="Normal"/>
-    <w:next w:val="Normal"/>
-    <w:uiPriority w:val="39"/>
-    <w:semiHidden/>
-    <w:unhideWhenUsed/>
-    <w:pPr>
-      <w:spacing w:after="100"/>
-      <w:ind w:left="1000"/>
-    </w:pPr>
-  </w:style>
-  <w:style w:type="paragraph" w:styleId="TOC7">
-    <w:name w:val="toc 7"/>
-    <w:basedOn w:val="Normal"/>
-    <w:next w:val="Normal"/>
-    <w:uiPriority w:val="39"/>
-    <w:semiHidden/>
-    <w:unhideWhenUsed/>
-    <w:pPr>
-      <w:spacing w:after="100"/>
-      <w:ind w:left="1200"/>
-    </w:pPr>
-  </w:style>
-  <w:style w:type="paragraph" w:styleId="TOC8">
-    <w:name w:val="toc 8"/>
-    <w:basedOn w:val="Normal"/>
-    <w:next w:val="Normal"/>
-    <w:uiPriority w:val="39"/>
-    <w:semiHidden/>
-    <w:unhideWhenUsed/>
-    <w:pPr>
-      <w:spacing w:after="100"/>
-      <w:ind w:left="1400"/>
-    </w:pPr>
-  </w:style>
-  <w:style w:type="paragraph" w:styleId="TOC9">
-    <w:name w:val="toc 9"/>
-    <w:basedOn w:val="Normal"/>
-    <w:next w:val="Normal"/>
-    <w:uiPriority w:val="39"/>
-    <w:semiHidden/>
-    <w:unhideWhenUsed/>
-    <w:pPr>
-      <w:spacing w:after="100"/>
-      <w:ind w:left="1600"/>
-    </w:pPr>
-  </w:style>
   <w:style w:type="character" w:styleId="Hyperlink">
     <w:name w:val="Hyperlink"/>
     <w:basedOn w:val="DefaultParagraphFont"/>
@@ -3372,302 +3277,5 @@
       <w:szCs w:val="20"/>
     </w:rPr>
   </w:style>
-  <w:style w:type="character" w:styleId="LineNumber">
-    <w:name w:val="line number"/>
-    <w:basedOn w:val="DefaultParagraphFont"/>
-    <w:uiPriority w:val="99"/>
-    <w:semiHidden/>
-    <w:unhideWhenUsed/>
-  </w:style>
 </w:styles>
-</file>
-
-<file path=word/theme/theme1.xml><?xml version="1.0" encoding="utf-8"?>
-<a:theme xmlns:a="http://schemas.openxmlformats.org/drawingml/2006/main" name="Office Theme">
-  <a:themeElements>
-    <a:clrScheme name="Office">
-      <a:dk1>
-        <a:sysClr val="windowText" lastClr="000000"/>
-      </a:dk1>
-      <a:lt1>
-        <a:sysClr val="window" lastClr="FFFFFF"/>
-      </a:lt1>
-      <a:dk2>
-        <a:srgbClr val="44546A"/>
-      </a:dk2>
-      <a:lt2>
-        <a:srgbClr val="E7E6E6"/>
-      </a:lt2>
-      <a:accent1>
-        <a:srgbClr val="4472C4"/>
-      </a:accent1>
-      <a:accent2>
-        <a:srgbClr val="ED7D31"/>
-      </a:accent2>
-      <a:accent3>
-        <a:srgbClr val="A5A5A5"/>
-      </a:accent3>
-      <a:accent4>
-        <a:srgbClr val="FFC000"/>
-      </a:accent4>
-      <a:accent5>
-        <a:srgbClr val="5B9BD5"/>
-      </a:accent5>
-      <a:accent6>
-        <a:srgbClr val="70AD47"/>
-      </a:accent6>
-      <a:hlink>
-        <a:srgbClr val="0563C1"/>
-      </a:hlink>
-      <a:folHlink>
-        <a:srgbClr val="954F72"/>
-      </a:folHlink>
-    </a:clrScheme>
-    <a:fontScheme name="Office">
-      <a:majorFont>
-        <a:latin typeface="Calibri Light" panose="020F0302020204030204"/>
-        <a:ea typeface=""/>
-        <a:cs typeface=""/>
-        <a:font script="Jpan" typeface="游ゴシック Light"/>
-        <a:font script="Hang" typeface="맑은 고딕"/>
-        <a:font script="Hans" typeface="等线 Light"/>
-        <a:font script="Hant" typeface="新細明體"/>
-        <a:font script="Arab" typeface="Times New Roman"/>
-        <a:font script="Hebr" typeface="Times New Roman"/>
-        <a:font script="Thai" typeface="Angsana New"/>
-        <a:font script="Ethi" typeface="Nyala"/>
-        <a:font script="Beng" typeface="Vrinda"/>
-        <a:font script="Gujr" typeface="Shruti"/>
-        <a:font script="Khmr" typeface="MoolBoran"/>
-        <a:font script="Knda" typeface="Tunga"/>
-        <a:font script="Guru" typeface="Raavi"/>
-        <a:font script="Cans" typeface="Euphemia"/>
-        <a:font script="Cher" typeface="Plantagenet Cherokee"/>
-        <a:font script="Yiii" typeface="Microsoft Yi Baiti"/>
-        <a:font script="Tibt" typeface="Microsoft Himalaya"/>
-        <a:font script="Thaa" typeface="MV Boli"/>
-        <a:font script="Deva" typeface="Mangal"/>
-        <a:font script="Telu" typeface="Gautami"/>
-        <a:font script="Taml" typeface="Latha"/>
-        <a:font script="Syrc" typeface="Estrangelo Edessa"/>
-        <a:font script="Orya" typeface="Kalinga"/>
-        <a:font script="Mlym" typeface="Kartika"/>
-        <a:font script="Laoo" typeface="DokChampa"/>
-        <a:font script="Sinh" typeface="Iskoola Pota"/>
-        <a:font script="Mong" typeface="Mongolian Baiti"/>
-        <a:font script="Viet" typeface="Times New Roman"/>
-        <a:font script="Uigh" typeface="Microsoft Uighur"/>
-        <a:font script="Geor" typeface="Sylfaen"/>
-        <a:font script="Armn" typeface="Arial"/>
-        <a:font script="Bugi" typeface="Leelawadee UI"/>
-        <a:font script="Bopo" typeface="Microsoft JhengHei"/>
-        <a:font script="Java" typeface="Javanese Text"/>
-        <a:font script="Lisu" typeface="Segoe UI"/>
-        <a:font script="Mymr" typeface="Myanmar Text"/>
-        <a:font script="Nkoo" typeface="Ebrima"/>
-        <a:font script="Olck" typeface="Nirmala UI"/>
-        <a:font script="Osma" typeface="Ebrima"/>
-        <a:font script="Phag" typeface="Phagspa"/>
-        <a:font script="Syrn" typeface="Estrangelo Edessa"/>
-        <a:font script="Syrj" typeface="Estrangelo Edessa"/>
-        <a:font script="Syre" typeface="Estrangelo Edessa"/>
-        <a:font script="Sora" typeface="Nirmala UI"/>
-        <a:font script="Tale" typeface="Microsoft Tai Le"/>
-        <a:font script="Talu" typeface="Microsoft New Tai Lue"/>
-        <a:font script="Tfng" typeface="Ebrima"/>
-      </a:majorFont>
-      <a:minorFont>
-        <a:latin typeface="Calibri" panose="020F0502020204030204"/>
-        <a:ea typeface=""/>
-        <a:cs typeface=""/>
-        <a:font script="Jpan" typeface="游明朝"/>
-        <a:font script="Hang" typeface="맑은 고딕"/>
-        <a:font script="Hans" typeface="等线"/>
-        <a:font script="Hant" typeface="新細明體"/>
-        <a:font script="Arab" typeface="Arial"/>
-        <a:font script="Hebr" typeface="Arial"/>
-        <a:font script="Thai" typeface="Cordia New"/>
-        <a:font script="Ethi" typeface="Nyala"/>
-        <a:font script="Beng" typeface="Vrinda"/>
-        <a:font script="Gujr" typeface="Shruti"/>
-        <a:font script="Khmr" typeface="DaunPenh"/>
-        <a:font script="Knda" typeface="Tunga"/>
-        <a:font script="Guru" typeface="Raavi"/>
-        <a:font script="Cans" typeface="Euphemia"/>
-        <a:font script="Cher" typeface="Plantagenet Cherokee"/>
-        <a:font script="Yiii" typeface="Microsoft Yi Baiti"/>
-        <a:font script="Tibt" typeface="Microsoft Himalaya"/>
-        <a:font script="Thaa" typeface="MV Boli"/>
-        <a:font script="Deva" typeface="Mangal"/>
-        <a:font script="Telu" typeface="Gautami"/>
-        <a:font script="Taml" typeface="Latha"/>
-        <a:font script="Syrc" typeface="Estrangelo Edessa"/>
-        <a:font script="Orya" typeface="Kalinga"/>
-        <a:font script="Mlym" typeface="Kartika"/>
-        <a:font script="Laoo" typeface="DokChampa"/>
-        <a:font script="Sinh" typeface="Iskoola Pota"/>
-        <a:font script="Mong" typeface="Mongolian Baiti"/>
-        <a:font script="Viet" typeface="Arial"/>
-        <a:font script="Uigh" typeface="Microsoft Uighur"/>
-        <a:font script="Geor" typeface="Sylfaen"/>
-        <a:font script="Armn" typeface="Arial"/>
-        <a:font script="Bugi" typeface="Leelawadee UI"/>
-        <a:font script="Bopo" typeface="Microsoft JhengHei"/>
-        <a:font script="Java" typeface="Javanese Text"/>
-        <a:font script="Lisu" typeface="Segoe UI"/>
-        <a:font script="Mymr" typeface="Myanmar Text"/>
-        <a:font script="Nkoo" typeface="Ebrima"/>
-        <a:font script="Olck" typeface="Nirmala UI"/>
-        <a:font script="Osma" typeface="Ebrima"/>
-        <a:font script="Phag" typeface="Phagspa"/>
-        <a:font script="Syrn" typeface="Estrangelo Edessa"/>
-        <a:font script="Syrj" typeface="Estrangelo Edessa"/>
-        <a:font script="Syre" typeface="Estrangelo Edessa"/>
-        <a:font script="Sora" typeface="Nirmala UI"/>
-        <a:font script="Tale" typeface="Microsoft Tai Le"/>
-        <a:font script="Talu" typeface="Microsoft New Tai Lue"/>
-        <a:font script="Tfng" typeface="Ebrima"/>
-      </a:minorFont>
-    </a:fontScheme>
-    <a:fmtScheme name="Office">
-      <a:fillStyleLst>
-        <a:solidFill>
-          <a:schemeClr val="phClr"/>
-        </a:solidFill>
-        <a:gradFill rotWithShape="true">
-          <a:gsLst>
-            <a:gs pos="0">
-              <a:schemeClr val="phClr">
-                <a:lumMod val="110000"/>
-                <a:satMod val="105000"/>
-                <a:tint val="67000"/>
-              </a:schemeClr>
-            </a:gs>
-            <a:gs pos="50000">
-              <a:schemeClr val="phClr">
-                <a:lumMod val="105000"/>
-                <a:satMod val="103000"/>
-                <a:tint val="73000"/>
-              </a:schemeClr>
-            </a:gs>
-            <a:gs pos="100000">
-              <a:schemeClr val="phClr">
-                <a:lumMod val="105000"/>
-                <a:satMod val="109000"/>
-                <a:tint val="81000"/>
-              </a:schemeClr>
-            </a:gs>
-          </a:gsLst>
-          <a:lin ang="5400000" scaled="false"/>
-        </a:gradFill>
-        <a:gradFill rotWithShape="true">
-          <a:gsLst>
-            <a:gs pos="0">
-              <a:schemeClr val="phClr">
-                <a:satMod val="103000"/>
-                <a:lumMod val="102000"/>
-                <a:tint val="94000"/>
-              </a:schemeClr>
-            </a:gs>
-            <a:gs pos="50000">
-              <a:schemeClr val="phClr">
-                <a:satMod val="110000"/>
-                <a:lumMod val="100000"/>
-                <a:shade val="100000"/>
-              </a:schemeClr>
-            </a:gs>
-            <a:gs pos="100000">
-              <a:schemeClr val="phClr">
-                <a:lumMod val="99000"/>
-                <a:satMod val="120000"/>
-                <a:shade val="78000"/>
-              </a:schemeClr>
-            </a:gs>
-          </a:gsLst>
-          <a:lin ang="5400000" scaled="false"/>
-        </a:gradFill>
-      </a:fillStyleLst>
-      <a:lnStyleLst>
-        <a:ln w="6350" cap="flat" cmpd="sng" algn="ctr">
-          <a:solidFill>
-            <a:schemeClr val="phClr"/>
-          </a:solidFill>
-          <a:prstDash val="solid"/>
-          <a:miter lim="800000"/>
-        </a:ln>
-        <a:ln w="12700" cap="flat" cmpd="sng" algn="ctr">
-          <a:solidFill>
-            <a:schemeClr val="phClr"/>
-          </a:solidFill>
-          <a:prstDash val="solid"/>
-          <a:miter lim="800000"/>
-        </a:ln>
-        <a:ln w="19050" cap="flat" cmpd="sng" algn="ctr">
-          <a:solidFill>
-            <a:schemeClr val="phClr"/>
-          </a:solidFill>
-          <a:prstDash val="solid"/>
-          <a:miter lim="800000"/>
-        </a:ln>
-      </a:lnStyleLst>
-      <a:effectStyleLst>
-        <a:effectStyle>
-          <a:effectLst/>
-        </a:effectStyle>
-        <a:effectStyle>
-          <a:effectLst/>
-        </a:effectStyle>
-        <a:effectStyle>
-          <a:effectLst>
-            <a:outerShdw blurRad="57150" dist="19050" dir="5400000" algn="ctr" rotWithShape="false">
-              <a:srgbClr val="000000">
-                <a:alpha val="63000"/>
-              </a:srgbClr>
-            </a:outerShdw>
-          </a:effectLst>
-        </a:effectStyle>
-      </a:effectStyleLst>
-      <a:bgFillStyleLst>
-        <a:solidFill>
-          <a:schemeClr val="phClr"/>
-        </a:solidFill>
-        <a:solidFill>
-          <a:schemeClr val="phClr">
-            <a:tint val="95000"/>
-            <a:satMod val="170000"/>
-          </a:schemeClr>
-        </a:solidFill>
-        <a:gradFill rotWithShape="true">
-          <a:gsLst>
-            <a:gs pos="0">
-              <a:schemeClr val="phClr">
-                <a:tint val="93000"/>
-                <a:satMod val="150000"/>
-                <a:shade val="98000"/>
-                <a:lumMod val="102000"/>
-              </a:schemeClr>
-            </a:gs>
-            <a:gs pos="50000">
-              <a:schemeClr val="phClr">
-                <a:tint val="98000"/>
-                <a:satMod val="130000"/>
-                <a:shade val="90000"/>
-                <a:lumMod val="103000"/>
-              </a:schemeClr>
-            </a:gs>
-            <a:gs pos="100000">
-              <a:schemeClr val="phClr">
-                <a:shade val="63000"/>
-                <a:satMod val="120000"/>
-              </a:schemeClr>
-            </a:gs>
-          </a:gsLst>
-          <a:lin ang="5400000" scaled="false"/>
-        </a:gradFill>
-      </a:bgFillStyleLst>
-    </a:fmtScheme>
-  </a:themeElements>
-  <a:objectDefaults/>
-  <a:extraClrSchemeLst/>
-</a:theme>
 </file>
</xml_diff>

<commit_message>
Induccion Aire Express: formulario con 10 resultados (Confirmo visita, Reprogramo visita)
Co-Authored-By: Claude Opus 5.5 <noreply@anthropic.com>
</commit_message>
<xml_diff>
--- a/induccion-aire-express/guiones/docs/00_LEEME_PRIMERO.docx
+++ b/induccion-aire-express/guiones/docs/00_LEEME_PRIMERO.docx
@@ -2469,7 +2469,7 @@
           <w:sz w:val="20"/>
           <w:szCs w:val="20"/>
         </w:rPr>
-        <w:t xml:space="preserve">Al colgar llenas el formulario (https://api.leadconnectorhq.com/widget/form/DGoYUAAWeaqimug9GUci) con uno de los 8 resultados: Agendó visita · No contesta · Llamar después · No interesado · Número equivocado · Fuera de zona · Esperando foto / precio · Precio aceptado - enviar contrato.</w:t>
+        <w:t xml:space="preserve">Al colgar llenas el formulario (https://api.leadconnectorhq.com/widget/form/DGoYUAAWeaqimug9GUci) con uno de los 10 resultados: Agendó visita · No contesta · Llamar después · No interesado · Número equivocado · Fuera de zona · Esperando foto / precio · Precio aceptado - enviar contrato · Confirmó visita · Reprogramó visita.</w:t>
       </w:r>
     </w:p>
     <w:p>
@@ -2992,7 +2992,7 @@
         <w:sz w:val="16"/>
         <w:szCs w:val="16"/>
       </w:rPr>
-      <w:t xml:space="preserve">   |   Inducción comercial</w:t>
+      <w:t xml:space="preserve">   |   Estrategia Comercial</w:t>
     </w:r>
   </w:p>
 </w:hdr>

</xml_diff>

<commit_message>
Induccion Aire Express: confirmacion por recordatorios; llamada solo si el cliente no confirma
Co-Authored-By: Claude Opus 5.5 <noreply@anthropic.com>
</commit_message>
<xml_diff>
--- a/induccion-aire-express/guiones/docs/00_LEEME_PRIMERO.docx
+++ b/induccion-aire-express/guiones/docs/00_LEEME_PRIMERO.docx
@@ -98,9 +98,9 @@
         </w:tblBorders>
       </w:tblPr>
       <w:tblGrid>
-        <w:gridCol w:w="1466"/>
-        <w:gridCol w:w="3493"/>
-        <w:gridCol w:w="5013"/>
+        <w:gridCol w:w="1454"/>
+        <w:gridCol w:w="3463"/>
+        <w:gridCol w:w="5055"/>
       </w:tblGrid>
       <w:tr>
         <w:trPr>
@@ -108,7 +108,7 @@
         </w:trPr>
         <w:tc>
           <w:tcPr>
-            <w:tcW w:type="dxa" w:w="1466"/>
+            <w:tcW w:type="dxa" w:w="1454"/>
             <w:tcBorders>
               <w:top w:val="single" w:color="CCCCCC" w:sz="1"/>
               <w:left w:val="single" w:color="CCCCCC" w:sz="1"/>
@@ -143,7 +143,7 @@
         </w:tc>
         <w:tc>
           <w:tcPr>
-            <w:tcW w:type="dxa" w:w="3493"/>
+            <w:tcW w:type="dxa" w:w="3463"/>
             <w:tcBorders>
               <w:top w:val="single" w:color="CCCCCC" w:sz="1"/>
               <w:left w:val="single" w:color="CCCCCC" w:sz="1"/>
@@ -178,7 +178,7 @@
         </w:tc>
         <w:tc>
           <w:tcPr>
-            <w:tcW w:type="dxa" w:w="5013"/>
+            <w:tcW w:type="dxa" w:w="5055"/>
             <w:tcBorders>
               <w:top w:val="single" w:color="CCCCCC" w:sz="1"/>
               <w:left w:val="single" w:color="CCCCCC" w:sz="1"/>
@@ -218,7 +218,7 @@
         </w:trPr>
         <w:tc>
           <w:tcPr>
-            <w:tcW w:type="dxa" w:w="1466"/>
+            <w:tcW w:type="dxa" w:w="1454"/>
             <w:tcBorders>
               <w:top w:val="single" w:color="CCCCCC" w:sz="1"/>
               <w:left w:val="single" w:color="CCCCCC" w:sz="1"/>
@@ -250,7 +250,7 @@
         </w:tc>
         <w:tc>
           <w:tcPr>
-            <w:tcW w:type="dxa" w:w="3493"/>
+            <w:tcW w:type="dxa" w:w="3463"/>
             <w:tcBorders>
               <w:top w:val="single" w:color="CCCCCC" w:sz="1"/>
               <w:left w:val="single" w:color="CCCCCC" w:sz="1"/>
@@ -293,7 +293,7 @@
         </w:tc>
         <w:tc>
           <w:tcPr>
-            <w:tcW w:type="dxa" w:w="5013"/>
+            <w:tcW w:type="dxa" w:w="5055"/>
             <w:tcBorders>
               <w:top w:val="single" w:color="CCCCCC" w:sz="1"/>
               <w:left w:val="single" w:color="CCCCCC" w:sz="1"/>
@@ -348,7 +348,7 @@
         </w:trPr>
         <w:tc>
           <w:tcPr>
-            <w:tcW w:type="dxa" w:w="1466"/>
+            <w:tcW w:type="dxa" w:w="1454"/>
             <w:tcBorders>
               <w:top w:val="single" w:color="CCCCCC" w:sz="1"/>
               <w:left w:val="single" w:color="CCCCCC" w:sz="1"/>
@@ -380,7 +380,7 @@
         </w:tc>
         <w:tc>
           <w:tcPr>
-            <w:tcW w:type="dxa" w:w="3493"/>
+            <w:tcW w:type="dxa" w:w="3463"/>
             <w:tcBorders>
               <w:top w:val="single" w:color="CCCCCC" w:sz="1"/>
               <w:left w:val="single" w:color="CCCCCC" w:sz="1"/>
@@ -412,7 +412,7 @@
         </w:tc>
         <w:tc>
           <w:tcPr>
-            <w:tcW w:type="dxa" w:w="5013"/>
+            <w:tcW w:type="dxa" w:w="5055"/>
             <w:tcBorders>
               <w:top w:val="single" w:color="CCCCCC" w:sz="1"/>
               <w:left w:val="single" w:color="CCCCCC" w:sz="1"/>
@@ -449,7 +449,7 @@
         </w:trPr>
         <w:tc>
           <w:tcPr>
-            <w:tcW w:type="dxa" w:w="1466"/>
+            <w:tcW w:type="dxa" w:w="1454"/>
             <w:tcBorders>
               <w:top w:val="single" w:color="CCCCCC" w:sz="1"/>
               <w:left w:val="single" w:color="CCCCCC" w:sz="1"/>
@@ -481,7 +481,7 @@
         </w:tc>
         <w:tc>
           <w:tcPr>
-            <w:tcW w:type="dxa" w:w="3493"/>
+            <w:tcW w:type="dxa" w:w="3463"/>
             <w:tcBorders>
               <w:top w:val="single" w:color="CCCCCC" w:sz="1"/>
               <w:left w:val="single" w:color="CCCCCC" w:sz="1"/>
@@ -513,7 +513,7 @@
         </w:tc>
         <w:tc>
           <w:tcPr>
-            <w:tcW w:type="dxa" w:w="5013"/>
+            <w:tcW w:type="dxa" w:w="5055"/>
             <w:tcBorders>
               <w:top w:val="single" w:color="CCCCCC" w:sz="1"/>
               <w:left w:val="single" w:color="CCCCCC" w:sz="1"/>
@@ -539,7 +539,7 @@
                 <w:sz w:val="17"/>
                 <w:szCs w:val="17"/>
               </w:rPr>
-              <w:t xml:space="preserve">El guion de las confirmaciones (día antes y mismo día) y del seguimiento de cotización (D+1 y D+3).</w:t>
+              <w:t xml:space="preserve">El guion de la confirmación del día antes (solo a quien no confirmó por mensaje) y del seguimiento de cotización (D+1 y D+3).</w:t>
             </w:r>
           </w:p>
         </w:tc>
@@ -550,7 +550,7 @@
         </w:trPr>
         <w:tc>
           <w:tcPr>
-            <w:tcW w:type="dxa" w:w="1466"/>
+            <w:tcW w:type="dxa" w:w="1454"/>
             <w:tcBorders>
               <w:top w:val="single" w:color="CCCCCC" w:sz="1"/>
               <w:left w:val="single" w:color="CCCCCC" w:sz="1"/>
@@ -582,7 +582,7 @@
         </w:tc>
         <w:tc>
           <w:tcPr>
-            <w:tcW w:type="dxa" w:w="3493"/>
+            <w:tcW w:type="dxa" w:w="3463"/>
             <w:tcBorders>
               <w:top w:val="single" w:color="CCCCCC" w:sz="1"/>
               <w:left w:val="single" w:color="CCCCCC" w:sz="1"/>
@@ -614,7 +614,7 @@
         </w:tc>
         <w:tc>
           <w:tcPr>
-            <w:tcW w:type="dxa" w:w="5013"/>
+            <w:tcW w:type="dxa" w:w="5055"/>
             <w:tcBorders>
               <w:top w:val="single" w:color="CCCCCC" w:sz="1"/>
               <w:left w:val="single" w:color="CCCCCC" w:sz="1"/>
@@ -651,7 +651,7 @@
         </w:trPr>
         <w:tc>
           <w:tcPr>
-            <w:tcW w:type="dxa" w:w="1466"/>
+            <w:tcW w:type="dxa" w:w="1454"/>
             <w:tcBorders>
               <w:top w:val="single" w:color="CCCCCC" w:sz="1"/>
               <w:left w:val="single" w:color="CCCCCC" w:sz="1"/>
@@ -683,7 +683,7 @@
         </w:tc>
         <w:tc>
           <w:tcPr>
-            <w:tcW w:type="dxa" w:w="3493"/>
+            <w:tcW w:type="dxa" w:w="3463"/>
             <w:tcBorders>
               <w:top w:val="single" w:color="CCCCCC" w:sz="1"/>
               <w:left w:val="single" w:color="CCCCCC" w:sz="1"/>
@@ -715,7 +715,7 @@
         </w:tc>
         <w:tc>
           <w:tcPr>
-            <w:tcW w:type="dxa" w:w="5013"/>
+            <w:tcW w:type="dxa" w:w="5055"/>
             <w:tcBorders>
               <w:top w:val="single" w:color="CCCCCC" w:sz="1"/>
               <w:left w:val="single" w:color="CCCCCC" w:sz="1"/>
@@ -772,7 +772,7 @@
         </w:trPr>
         <w:tc>
           <w:tcPr>
-            <w:tcW w:type="dxa" w:w="1466"/>
+            <w:tcW w:type="dxa" w:w="1454"/>
             <w:tcBorders>
               <w:top w:val="single" w:color="CCCCCC" w:sz="1"/>
               <w:left w:val="single" w:color="CCCCCC" w:sz="1"/>
@@ -804,7 +804,7 @@
         </w:tc>
         <w:tc>
           <w:tcPr>
-            <w:tcW w:type="dxa" w:w="3493"/>
+            <w:tcW w:type="dxa" w:w="3463"/>
             <w:tcBorders>
               <w:top w:val="single" w:color="CCCCCC" w:sz="1"/>
               <w:left w:val="single" w:color="CCCCCC" w:sz="1"/>
@@ -836,7 +836,7 @@
         </w:tc>
         <w:tc>
           <w:tcPr>
-            <w:tcW w:type="dxa" w:w="5013"/>
+            <w:tcW w:type="dxa" w:w="5055"/>
             <w:tcBorders>
               <w:top w:val="single" w:color="CCCCCC" w:sz="1"/>
               <w:left w:val="single" w:color="CCCCCC" w:sz="1"/>
@@ -873,7 +873,7 @@
         </w:trPr>
         <w:tc>
           <w:tcPr>
-            <w:tcW w:type="dxa" w:w="1466"/>
+            <w:tcW w:type="dxa" w:w="1454"/>
             <w:tcBorders>
               <w:top w:val="single" w:color="CCCCCC" w:sz="1"/>
               <w:left w:val="single" w:color="CCCCCC" w:sz="1"/>
@@ -905,7 +905,7 @@
         </w:tc>
         <w:tc>
           <w:tcPr>
-            <w:tcW w:type="dxa" w:w="3493"/>
+            <w:tcW w:type="dxa" w:w="3463"/>
             <w:tcBorders>
               <w:top w:val="single" w:color="CCCCCC" w:sz="1"/>
               <w:left w:val="single" w:color="CCCCCC" w:sz="1"/>
@@ -937,7 +937,7 @@
         </w:tc>
         <w:tc>
           <w:tcPr>
-            <w:tcW w:type="dxa" w:w="5013"/>
+            <w:tcW w:type="dxa" w:w="5055"/>
             <w:tcBorders>
               <w:top w:val="single" w:color="CCCCCC" w:sz="1"/>
               <w:left w:val="single" w:color="CCCCCC" w:sz="1"/>
@@ -974,7 +974,7 @@
         </w:trPr>
         <w:tc>
           <w:tcPr>
-            <w:tcW w:type="dxa" w:w="1466"/>
+            <w:tcW w:type="dxa" w:w="1454"/>
             <w:tcBorders>
               <w:top w:val="single" w:color="CCCCCC" w:sz="1"/>
               <w:left w:val="single" w:color="CCCCCC" w:sz="1"/>
@@ -1006,7 +1006,7 @@
         </w:tc>
         <w:tc>
           <w:tcPr>
-            <w:tcW w:type="dxa" w:w="3493"/>
+            <w:tcW w:type="dxa" w:w="3463"/>
             <w:tcBorders>
               <w:top w:val="single" w:color="CCCCCC" w:sz="1"/>
               <w:left w:val="single" w:color="CCCCCC" w:sz="1"/>
@@ -1038,7 +1038,7 @@
         </w:tc>
         <w:tc>
           <w:tcPr>
-            <w:tcW w:type="dxa" w:w="5013"/>
+            <w:tcW w:type="dxa" w:w="5055"/>
             <w:tcBorders>
               <w:top w:val="single" w:color="CCCCCC" w:sz="1"/>
               <w:left w:val="single" w:color="CCCCCC" w:sz="1"/>

</xml_diff>